<commit_message>
Documentation for Tenants in sharepoint.
</commit_message>
<xml_diff>
--- a/Microsoft Tools Documentation/General/SharePoint Framework (SPFx).docx
+++ b/Microsoft Tools Documentation/General/SharePoint Framework (SPFx).docx
@@ -4349,27 +4349,8 @@
             <w14:round/>
           </w14:textOutline>
         </w:rPr>
-        <w:t>import * as React from 'react</w:t>
-      </w:r>
-      <w:proofErr w:type="gramStart"/>
-      <w:r>
-        <w:rPr>
-          <w:color w:val="000000" w:themeColor="text1"/>
-          <w:lang w:val="en-CA"/>
-          <w14:shadow w14:blurRad="38100" w14:dist="19050" w14:dir="2700000" w14:sx="100000" w14:sy="100000" w14:kx="0" w14:ky="0" w14:algn="tl">
-            <w14:schemeClr w14:val="dk1">
-              <w14:alpha w14:val="60000"/>
-            </w14:schemeClr>
-          </w14:shadow>
-          <w14:textOutline w14:w="0" w14:cap="flat" w14:cmpd="sng" w14:algn="ctr">
-            <w14:noFill/>
-            <w14:prstDash w14:val="solid"/>
-            <w14:round/>
-          </w14:textOutline>
-        </w:rPr>
-        <w:t>';</w:t>
-      </w:r>
-      <w:proofErr w:type="gramEnd"/>
+        <w:t>import * as React from 'react';</w:t>
+      </w:r>
     </w:p>
     <w:p>
       <w:pPr>
@@ -4403,9 +4384,9 @@
             <w14:round/>
           </w14:textOutline>
         </w:rPr>
-        <w:t xml:space="preserve">import </w:t>
-      </w:r>
-      <w:proofErr w:type="gramStart"/>
+        <w:t xml:space="preserve">import { </w:t>
+      </w:r>
+      <w:proofErr w:type="spellStart"/>
       <w:r>
         <w:rPr>
           <w:color w:val="000000" w:themeColor="text1"/>
@@ -4421,28 +4402,9 @@
             <w14:round/>
           </w14:textOutline>
         </w:rPr>
-        <w:t xml:space="preserve">{ </w:t>
-      </w:r>
-      <w:proofErr w:type="spellStart"/>
-      <w:r>
-        <w:rPr>
-          <w:color w:val="000000" w:themeColor="text1"/>
-          <w:lang w:val="en-CA"/>
-          <w14:shadow w14:blurRad="38100" w14:dist="19050" w14:dir="2700000" w14:sx="100000" w14:sy="100000" w14:kx="0" w14:ky="0" w14:algn="tl">
-            <w14:schemeClr w14:val="dk1">
-              <w14:alpha w14:val="60000"/>
-            </w14:schemeClr>
-          </w14:shadow>
-          <w14:textOutline w14:w="0" w14:cap="flat" w14:cmpd="sng" w14:algn="ctr">
-            <w14:noFill/>
-            <w14:prstDash w14:val="solid"/>
-            <w14:round/>
-          </w14:textOutline>
-        </w:rPr>
         <w:t>IHelloWorldProps</w:t>
       </w:r>
       <w:proofErr w:type="spellEnd"/>
-      <w:proofErr w:type="gramEnd"/>
       <w:r>
         <w:rPr>
           <w:color w:val="000000" w:themeColor="text1"/>
@@ -4530,43 +4492,7 @@
           </w14:textOutline>
         </w:rPr>
         <w:lastRenderedPageBreak/>
-        <w:t xml:space="preserve">import </w:t>
-      </w:r>
-      <w:proofErr w:type="gramStart"/>
-      <w:r>
-        <w:rPr>
-          <w:color w:val="000000" w:themeColor="text1"/>
-          <w:lang w:val="en-CA"/>
-          <w14:shadow w14:blurRad="38100" w14:dist="19050" w14:dir="2700000" w14:sx="100000" w14:sy="100000" w14:kx="0" w14:ky="0" w14:algn="tl">
-            <w14:schemeClr w14:val="dk1">
-              <w14:alpha w14:val="60000"/>
-            </w14:schemeClr>
-          </w14:shadow>
-          <w14:textOutline w14:w="0" w14:cap="flat" w14:cmpd="sng" w14:algn="ctr">
-            <w14:noFill/>
-            <w14:prstDash w14:val="solid"/>
-            <w14:round/>
-          </w14:textOutline>
-        </w:rPr>
-        <w:t>{ escape</w:t>
-      </w:r>
-      <w:proofErr w:type="gramEnd"/>
-      <w:r>
-        <w:rPr>
-          <w:color w:val="000000" w:themeColor="text1"/>
-          <w:lang w:val="en-CA"/>
-          <w14:shadow w14:blurRad="38100" w14:dist="19050" w14:dir="2700000" w14:sx="100000" w14:sy="100000" w14:kx="0" w14:ky="0" w14:algn="tl">
-            <w14:schemeClr w14:val="dk1">
-              <w14:alpha w14:val="60000"/>
-            </w14:schemeClr>
-          </w14:shadow>
-          <w14:textOutline w14:w="0" w14:cap="flat" w14:cmpd="sng" w14:algn="ctr">
-            <w14:noFill/>
-            <w14:prstDash w14:val="solid"/>
-            <w14:round/>
-          </w14:textOutline>
-        </w:rPr>
-        <w:t xml:space="preserve"> } from '@</w:t>
+        <w:t>import { escape } from '@</w:t>
       </w:r>
       <w:proofErr w:type="spellStart"/>
       <w:r>
@@ -4834,43 +4760,7 @@
             <w14:round/>
           </w14:textOutline>
         </w:rPr>
-        <w:t xml:space="preserve">  public </w:t>
-      </w:r>
-      <w:proofErr w:type="gramStart"/>
-      <w:r>
-        <w:rPr>
-          <w:color w:val="000000" w:themeColor="text1"/>
-          <w:lang w:val="en-CA"/>
-          <w14:shadow w14:blurRad="38100" w14:dist="19050" w14:dir="2700000" w14:sx="100000" w14:sy="100000" w14:kx="0" w14:ky="0" w14:algn="tl">
-            <w14:schemeClr w14:val="dk1">
-              <w14:alpha w14:val="60000"/>
-            </w14:schemeClr>
-          </w14:shadow>
-          <w14:textOutline w14:w="0" w14:cap="flat" w14:cmpd="sng" w14:algn="ctr">
-            <w14:noFill/>
-            <w14:prstDash w14:val="solid"/>
-            <w14:round/>
-          </w14:textOutline>
-        </w:rPr>
-        <w:t>render(</w:t>
-      </w:r>
-      <w:proofErr w:type="gramEnd"/>
-      <w:r>
-        <w:rPr>
-          <w:color w:val="000000" w:themeColor="text1"/>
-          <w:lang w:val="en-CA"/>
-          <w14:shadow w14:blurRad="38100" w14:dist="19050" w14:dir="2700000" w14:sx="100000" w14:sy="100000" w14:kx="0" w14:ky="0" w14:algn="tl">
-            <w14:schemeClr w14:val="dk1">
-              <w14:alpha w14:val="60000"/>
-            </w14:schemeClr>
-          </w14:shadow>
-          <w14:textOutline w14:w="0" w14:cap="flat" w14:cmpd="sng" w14:algn="ctr">
-            <w14:noFill/>
-            <w14:prstDash w14:val="solid"/>
-            <w14:round/>
-          </w14:textOutline>
-        </w:rPr>
-        <w:t xml:space="preserve">): </w:t>
+        <w:t xml:space="preserve">  public render(): </w:t>
       </w:r>
       <w:proofErr w:type="spellStart"/>
       <w:r>
@@ -5050,7 +4940,6 @@
         <w:t xml:space="preserve">        &lt;span&gt;Hello, {escape(</w:t>
       </w:r>
       <w:proofErr w:type="spellStart"/>
-      <w:proofErr w:type="gramStart"/>
       <w:r>
         <w:rPr>
           <w:color w:val="000000" w:themeColor="text1"/>
@@ -5066,25 +4955,7 @@
             <w14:round/>
           </w14:textOutline>
         </w:rPr>
-        <w:t>this.props</w:t>
-      </w:r>
-      <w:proofErr w:type="gramEnd"/>
-      <w:r>
-        <w:rPr>
-          <w:color w:val="000000" w:themeColor="text1"/>
-          <w:lang w:val="en-CA"/>
-          <w14:shadow w14:blurRad="38100" w14:dist="19050" w14:dir="2700000" w14:sx="100000" w14:sy="100000" w14:kx="0" w14:ky="0" w14:algn="tl">
-            <w14:schemeClr w14:val="dk1">
-              <w14:alpha w14:val="60000"/>
-            </w14:schemeClr>
-          </w14:shadow>
-          <w14:textOutline w14:w="0" w14:cap="flat" w14:cmpd="sng" w14:algn="ctr">
-            <w14:noFill/>
-            <w14:prstDash w14:val="solid"/>
-            <w14:round/>
-          </w14:textOutline>
-        </w:rPr>
-        <w:t>.description</w:t>
+        <w:t>this.props.description</w:t>
       </w:r>
       <w:proofErr w:type="spellEnd"/>
       <w:r>
@@ -5394,6 +5265,3632 @@
           </w14:textOutline>
         </w:rPr>
         <w:t xml:space="preserve"> est un puissant outil permettant aux développeurs de créer des solutions modernes et personnalisées pour SharePoint. Il fournit un moyen flexible d'intégrer des applications riches et des expériences interactives dans SharePoint Online et SharePoint Server. Grâce à son utilisation de technologies modernes, il est particulièrement adapté pour les entreprises cherchant à créer des solutions dynamiques et évolutives dans l'écosystème Microsoft 365.</w:t>
+      </w:r>
+    </w:p>
+    <w:p>
+      <w:pPr>
+        <w:rPr>
+          <w:b/>
+          <w:bCs/>
+          <w:color w:val="000000" w:themeColor="text1"/>
+          <w14:textOutline w14:w="0" w14:cap="flat" w14:cmpd="sng" w14:algn="ctr">
+            <w14:noFill/>
+            <w14:prstDash w14:val="solid"/>
+            <w14:round/>
+          </w14:textOutline>
+          <w14:textFill>
+            <w14:gradFill>
+              <w14:gsLst>
+                <w14:gs w14:pos="21000">
+                  <w14:srgbClr w14:val="53575C"/>
+                </w14:gs>
+                <w14:gs w14:pos="88000">
+                  <w14:srgbClr w14:val="C5C7CA"/>
+                </w14:gs>
+              </w14:gsLst>
+              <w14:lin w14:ang="5400000" w14:scaled="0"/>
+            </w14:gradFill>
+          </w14:textFill>
+        </w:rPr>
+      </w:pPr>
+      <w:r>
+        <w:rPr>
+          <w:b/>
+          <w:bCs/>
+          <w:color w:val="000000" w:themeColor="text1"/>
+          <w14:textOutline w14:w="0" w14:cap="flat" w14:cmpd="sng" w14:algn="ctr">
+            <w14:noFill/>
+            <w14:prstDash w14:val="solid"/>
+            <w14:round/>
+          </w14:textOutline>
+          <w14:textFill>
+            <w14:gradFill>
+              <w14:gsLst>
+                <w14:gs w14:pos="21000">
+                  <w14:srgbClr w14:val="53575C"/>
+                </w14:gs>
+                <w14:gs w14:pos="88000">
+                  <w14:srgbClr w14:val="C5C7CA"/>
+                </w14:gs>
+              </w14:gsLst>
+              <w14:lin w14:ang="5400000" w14:scaled="0"/>
+            </w14:gradFill>
+          </w14:textFill>
+        </w:rPr>
+        <w:t>Qu'est-ce qu'un Tenant dans SharePoint ?</w:t>
+      </w:r>
+    </w:p>
+    <w:p>
+      <w:pPr>
+        <w:rPr>
+          <w:color w:val="000000" w:themeColor="text1"/>
+          <w14:textOutline w14:w="0" w14:cap="flat" w14:cmpd="sng" w14:algn="ctr">
+            <w14:noFill/>
+            <w14:prstDash w14:val="solid"/>
+            <w14:round/>
+          </w14:textOutline>
+          <w14:textFill>
+            <w14:gradFill>
+              <w14:gsLst>
+                <w14:gs w14:pos="21000">
+                  <w14:srgbClr w14:val="53575C"/>
+                </w14:gs>
+                <w14:gs w14:pos="88000">
+                  <w14:srgbClr w14:val="C5C7CA"/>
+                </w14:gs>
+              </w14:gsLst>
+              <w14:lin w14:ang="5400000" w14:scaled="0"/>
+            </w14:gradFill>
+          </w14:textFill>
+        </w:rPr>
+      </w:pPr>
+      <w:r>
+        <w:rPr>
+          <w:color w:val="000000" w:themeColor="text1"/>
+          <w14:textOutline w14:w="0" w14:cap="flat" w14:cmpd="sng" w14:algn="ctr">
+            <w14:noFill/>
+            <w14:prstDash w14:val="solid"/>
+            <w14:round/>
+          </w14:textOutline>
+          <w14:textFill>
+            <w14:gradFill>
+              <w14:gsLst>
+                <w14:gs w14:pos="21000">
+                  <w14:srgbClr w14:val="53575C"/>
+                </w14:gs>
+                <w14:gs w14:pos="88000">
+                  <w14:srgbClr w14:val="C5C7CA"/>
+                </w14:gs>
+              </w14:gsLst>
+              <w14:lin w14:ang="5400000" w14:scaled="0"/>
+            </w14:gradFill>
+          </w14:textFill>
+        </w:rPr>
+        <w:t xml:space="preserve">Un </w:t>
+      </w:r>
+      <w:r>
+        <w:rPr>
+          <w:b/>
+          <w:bCs/>
+          <w:color w:val="000000" w:themeColor="text1"/>
+          <w14:textOutline w14:w="0" w14:cap="flat" w14:cmpd="sng" w14:algn="ctr">
+            <w14:noFill/>
+            <w14:prstDash w14:val="solid"/>
+            <w14:round/>
+          </w14:textOutline>
+          <w14:textFill>
+            <w14:gradFill>
+              <w14:gsLst>
+                <w14:gs w14:pos="21000">
+                  <w14:srgbClr w14:val="53575C"/>
+                </w14:gs>
+                <w14:gs w14:pos="88000">
+                  <w14:srgbClr w14:val="C5C7CA"/>
+                </w14:gs>
+              </w14:gsLst>
+              <w14:lin w14:ang="5400000" w14:scaled="0"/>
+            </w14:gradFill>
+          </w14:textFill>
+        </w:rPr>
+        <w:t>Tenant</w:t>
+      </w:r>
+      <w:r>
+        <w:rPr>
+          <w:color w:val="000000" w:themeColor="text1"/>
+          <w14:textOutline w14:w="0" w14:cap="flat" w14:cmpd="sng" w14:algn="ctr">
+            <w14:noFill/>
+            <w14:prstDash w14:val="solid"/>
+            <w14:round/>
+          </w14:textOutline>
+          <w14:textFill>
+            <w14:gradFill>
+              <w14:gsLst>
+                <w14:gs w14:pos="21000">
+                  <w14:srgbClr w14:val="53575C"/>
+                </w14:gs>
+                <w14:gs w14:pos="88000">
+                  <w14:srgbClr w14:val="C5C7CA"/>
+                </w14:gs>
+              </w14:gsLst>
+              <w14:lin w14:ang="5400000" w14:scaled="0"/>
+            </w14:gradFill>
+          </w14:textFill>
+        </w:rPr>
+        <w:t xml:space="preserve"> dans SharePoint Online fait référence à l'environnement dédié d'Office 365 qui regroupe tous les services Microsoft 365 (SharePoint Online, OneDrive, Teams, etc.) sous une seule organisation. C'est une instance distincte et isolée fournie par Microsoft pour une entreprise ou un développeur.</w:t>
+      </w:r>
+    </w:p>
+    <w:p>
+      <w:pPr>
+        <w:rPr>
+          <w:color w:val="000000" w:themeColor="text1"/>
+          <w14:textOutline w14:w="0" w14:cap="flat" w14:cmpd="sng" w14:algn="ctr">
+            <w14:noFill/>
+            <w14:prstDash w14:val="solid"/>
+            <w14:round/>
+          </w14:textOutline>
+          <w14:textFill>
+            <w14:gradFill>
+              <w14:gsLst>
+                <w14:gs w14:pos="21000">
+                  <w14:srgbClr w14:val="53575C"/>
+                </w14:gs>
+                <w14:gs w14:pos="88000">
+                  <w14:srgbClr w14:val="C5C7CA"/>
+                </w14:gs>
+              </w14:gsLst>
+              <w14:lin w14:ang="5400000" w14:scaled="0"/>
+            </w14:gradFill>
+          </w14:textFill>
+        </w:rPr>
+      </w:pPr>
+      <w:r>
+        <w:rPr>
+          <w:color w:val="000000" w:themeColor="text1"/>
+          <w14:textOutline w14:w="0" w14:cap="flat" w14:cmpd="sng" w14:algn="ctr">
+            <w14:noFill/>
+            <w14:prstDash w14:val="solid"/>
+            <w14:round/>
+          </w14:textOutline>
+          <w14:textFill>
+            <w14:gradFill>
+              <w14:gsLst>
+                <w14:gs w14:pos="21000">
+                  <w14:srgbClr w14:val="53575C"/>
+                </w14:gs>
+                <w14:gs w14:pos="88000">
+                  <w14:srgbClr w14:val="C5C7CA"/>
+                </w14:gs>
+              </w14:gsLst>
+              <w14:lin w14:ang="5400000" w14:scaled="0"/>
+            </w14:gradFill>
+          </w14:textFill>
+        </w:rPr>
+        <w:t xml:space="preserve">Un </w:t>
+      </w:r>
+      <w:r>
+        <w:rPr>
+          <w:b/>
+          <w:bCs/>
+          <w:color w:val="000000" w:themeColor="text1"/>
+          <w14:textOutline w14:w="0" w14:cap="flat" w14:cmpd="sng" w14:algn="ctr">
+            <w14:noFill/>
+            <w14:prstDash w14:val="solid"/>
+            <w14:round/>
+          </w14:textOutline>
+          <w14:textFill>
+            <w14:gradFill>
+              <w14:gsLst>
+                <w14:gs w14:pos="21000">
+                  <w14:srgbClr w14:val="53575C"/>
+                </w14:gs>
+                <w14:gs w14:pos="88000">
+                  <w14:srgbClr w14:val="C5C7CA"/>
+                </w14:gs>
+              </w14:gsLst>
+              <w14:lin w14:ang="5400000" w14:scaled="0"/>
+            </w14:gradFill>
+          </w14:textFill>
+        </w:rPr>
+        <w:t>tenant</w:t>
+      </w:r>
+      <w:r>
+        <w:rPr>
+          <w:color w:val="000000" w:themeColor="text1"/>
+          <w14:textOutline w14:w="0" w14:cap="flat" w14:cmpd="sng" w14:algn="ctr">
+            <w14:noFill/>
+            <w14:prstDash w14:val="solid"/>
+            <w14:round/>
+          </w14:textOutline>
+          <w14:textFill>
+            <w14:gradFill>
+              <w14:gsLst>
+                <w14:gs w14:pos="21000">
+                  <w14:srgbClr w14:val="53575C"/>
+                </w14:gs>
+                <w14:gs w14:pos="88000">
+                  <w14:srgbClr w14:val="C5C7CA"/>
+                </w14:gs>
+              </w14:gsLst>
+              <w14:lin w14:ang="5400000" w14:scaled="0"/>
+            </w14:gradFill>
+          </w14:textFill>
+        </w:rPr>
+        <w:t xml:space="preserve"> est généralement lié à un domaine et se présente sous la forme :</w:t>
+      </w:r>
+      <w:r>
+        <w:rPr>
+          <w:color w:val="000000" w:themeColor="text1"/>
+          <w14:textOutline w14:w="0" w14:cap="flat" w14:cmpd="sng" w14:algn="ctr">
+            <w14:noFill/>
+            <w14:prstDash w14:val="solid"/>
+            <w14:round/>
+          </w14:textOutline>
+          <w14:textFill>
+            <w14:gradFill>
+              <w14:gsLst>
+                <w14:gs w14:pos="21000">
+                  <w14:srgbClr w14:val="53575C"/>
+                </w14:gs>
+                <w14:gs w14:pos="88000">
+                  <w14:srgbClr w14:val="C5C7CA"/>
+                </w14:gs>
+              </w14:gsLst>
+              <w14:lin w14:ang="5400000" w14:scaled="0"/>
+            </w14:gradFill>
+          </w14:textFill>
+        </w:rPr>
+        <w:br/>
+      </w:r>
+      <w:r>
+        <w:rPr>
+          <w:rFonts w:ascii="Segoe UI Emoji" w:hAnsi="Segoe UI Emoji" w:cs="Segoe UI Emoji"/>
+          <w:color w:val="000000" w:themeColor="text1"/>
+          <w14:textOutline w14:w="0" w14:cap="flat" w14:cmpd="sng" w14:algn="ctr">
+            <w14:noFill/>
+            <w14:prstDash w14:val="solid"/>
+            <w14:round/>
+          </w14:textOutline>
+          <w14:textFill>
+            <w14:gradFill>
+              <w14:gsLst>
+                <w14:gs w14:pos="21000">
+                  <w14:srgbClr w14:val="53575C"/>
+                </w14:gs>
+                <w14:gs w14:pos="88000">
+                  <w14:srgbClr w14:val="C5C7CA"/>
+                </w14:gs>
+              </w14:gsLst>
+              <w14:lin w14:ang="5400000" w14:scaled="0"/>
+            </w14:gradFill>
+          </w14:textFill>
+        </w:rPr>
+        <w:t>👉</w:t>
+      </w:r>
+      <w:r>
+        <w:rPr>
+          <w:color w:val="000000" w:themeColor="text1"/>
+          <w14:textOutline w14:w="0" w14:cap="flat" w14:cmpd="sng" w14:algn="ctr">
+            <w14:noFill/>
+            <w14:prstDash w14:val="solid"/>
+            <w14:round/>
+          </w14:textOutline>
+          <w14:textFill>
+            <w14:gradFill>
+              <w14:gsLst>
+                <w14:gs w14:pos="21000">
+                  <w14:srgbClr w14:val="53575C"/>
+                </w14:gs>
+                <w14:gs w14:pos="88000">
+                  <w14:srgbClr w14:val="C5C7CA"/>
+                </w14:gs>
+              </w14:gsLst>
+              <w14:lin w14:ang="5400000" w14:scaled="0"/>
+            </w14:gradFill>
+          </w14:textFill>
+        </w:rPr>
+        <w:t xml:space="preserve"> monentreprise.sharepoint.com</w:t>
+      </w:r>
+    </w:p>
+    <w:p>
+      <w:pPr>
+        <w:rPr>
+          <w:b/>
+          <w:bCs/>
+          <w:color w:val="000000" w:themeColor="text1"/>
+          <w14:textOutline w14:w="0" w14:cap="flat" w14:cmpd="sng" w14:algn="ctr">
+            <w14:noFill/>
+            <w14:prstDash w14:val="solid"/>
+            <w14:round/>
+          </w14:textOutline>
+          <w14:textFill>
+            <w14:gradFill>
+              <w14:gsLst>
+                <w14:gs w14:pos="21000">
+                  <w14:srgbClr w14:val="53575C"/>
+                </w14:gs>
+                <w14:gs w14:pos="88000">
+                  <w14:srgbClr w14:val="C5C7CA"/>
+                </w14:gs>
+              </w14:gsLst>
+              <w14:lin w14:ang="5400000" w14:scaled="0"/>
+            </w14:gradFill>
+          </w14:textFill>
+        </w:rPr>
+      </w:pPr>
+      <w:r>
+        <w:rPr>
+          <w:b/>
+          <w:bCs/>
+          <w:color w:val="000000" w:themeColor="text1"/>
+          <w14:textOutline w14:w="0" w14:cap="flat" w14:cmpd="sng" w14:algn="ctr">
+            <w14:noFill/>
+            <w14:prstDash w14:val="solid"/>
+            <w14:round/>
+          </w14:textOutline>
+          <w14:textFill>
+            <w14:gradFill>
+              <w14:gsLst>
+                <w14:gs w14:pos="21000">
+                  <w14:srgbClr w14:val="53575C"/>
+                </w14:gs>
+                <w14:gs w14:pos="88000">
+                  <w14:srgbClr w14:val="C5C7CA"/>
+                </w14:gs>
+              </w14:gsLst>
+              <w14:lin w14:ang="5400000" w14:scaled="0"/>
+            </w14:gradFill>
+          </w14:textFill>
+        </w:rPr>
+        <w:t xml:space="preserve">Pourquoi as-tu besoin d'un Tenant pour le développement </w:t>
+      </w:r>
+      <w:proofErr w:type="spellStart"/>
+      <w:r>
+        <w:rPr>
+          <w:b/>
+          <w:bCs/>
+          <w:color w:val="000000" w:themeColor="text1"/>
+          <w14:textOutline w14:w="0" w14:cap="flat" w14:cmpd="sng" w14:algn="ctr">
+            <w14:noFill/>
+            <w14:prstDash w14:val="solid"/>
+            <w14:round/>
+          </w14:textOutline>
+          <w14:textFill>
+            <w14:gradFill>
+              <w14:gsLst>
+                <w14:gs w14:pos="21000">
+                  <w14:srgbClr w14:val="53575C"/>
+                </w14:gs>
+                <w14:gs w14:pos="88000">
+                  <w14:srgbClr w14:val="C5C7CA"/>
+                </w14:gs>
+              </w14:gsLst>
+              <w14:lin w14:ang="5400000" w14:scaled="0"/>
+            </w14:gradFill>
+          </w14:textFill>
+        </w:rPr>
+        <w:t>SPFx</w:t>
+      </w:r>
+      <w:proofErr w:type="spellEnd"/>
+      <w:r>
+        <w:rPr>
+          <w:b/>
+          <w:bCs/>
+          <w:color w:val="000000" w:themeColor="text1"/>
+          <w14:textOutline w14:w="0" w14:cap="flat" w14:cmpd="sng" w14:algn="ctr">
+            <w14:noFill/>
+            <w14:prstDash w14:val="solid"/>
+            <w14:round/>
+          </w14:textOutline>
+          <w14:textFill>
+            <w14:gradFill>
+              <w14:gsLst>
+                <w14:gs w14:pos="21000">
+                  <w14:srgbClr w14:val="53575C"/>
+                </w14:gs>
+                <w14:gs w14:pos="88000">
+                  <w14:srgbClr w14:val="C5C7CA"/>
+                </w14:gs>
+              </w14:gsLst>
+              <w14:lin w14:ang="5400000" w14:scaled="0"/>
+            </w14:gradFill>
+          </w14:textFill>
+        </w:rPr>
+        <w:t xml:space="preserve"> ?</w:t>
+      </w:r>
+    </w:p>
+    <w:p>
+      <w:pPr>
+        <w:rPr>
+          <w:color w:val="000000" w:themeColor="text1"/>
+          <w14:textOutline w14:w="0" w14:cap="flat" w14:cmpd="sng" w14:algn="ctr">
+            <w14:noFill/>
+            <w14:prstDash w14:val="solid"/>
+            <w14:round/>
+          </w14:textOutline>
+          <w14:textFill>
+            <w14:gradFill>
+              <w14:gsLst>
+                <w14:gs w14:pos="21000">
+                  <w14:srgbClr w14:val="53575C"/>
+                </w14:gs>
+                <w14:gs w14:pos="88000">
+                  <w14:srgbClr w14:val="C5C7CA"/>
+                </w14:gs>
+              </w14:gsLst>
+              <w14:lin w14:ang="5400000" w14:scaled="0"/>
+            </w14:gradFill>
+          </w14:textFill>
+        </w:rPr>
+      </w:pPr>
+      <w:r>
+        <w:rPr>
+          <w:color w:val="000000" w:themeColor="text1"/>
+          <w14:textOutline w14:w="0" w14:cap="flat" w14:cmpd="sng" w14:algn="ctr">
+            <w14:noFill/>
+            <w14:prstDash w14:val="solid"/>
+            <w14:round/>
+          </w14:textOutline>
+          <w14:textFill>
+            <w14:gradFill>
+              <w14:gsLst>
+                <w14:gs w14:pos="21000">
+                  <w14:srgbClr w14:val="53575C"/>
+                </w14:gs>
+                <w14:gs w14:pos="88000">
+                  <w14:srgbClr w14:val="C5C7CA"/>
+                </w14:gs>
+              </w14:gsLst>
+              <w14:lin w14:ang="5400000" w14:scaled="0"/>
+            </w14:gradFill>
+          </w14:textFill>
+        </w:rPr>
+        <w:t xml:space="preserve">Lorsque tu développes des Web Parts avec </w:t>
+      </w:r>
+      <w:r>
+        <w:rPr>
+          <w:b/>
+          <w:bCs/>
+          <w:color w:val="000000" w:themeColor="text1"/>
+          <w14:textOutline w14:w="0" w14:cap="flat" w14:cmpd="sng" w14:algn="ctr">
+            <w14:noFill/>
+            <w14:prstDash w14:val="solid"/>
+            <w14:round/>
+          </w14:textOutline>
+          <w14:textFill>
+            <w14:gradFill>
+              <w14:gsLst>
+                <w14:gs w14:pos="21000">
+                  <w14:srgbClr w14:val="53575C"/>
+                </w14:gs>
+                <w14:gs w14:pos="88000">
+                  <w14:srgbClr w14:val="C5C7CA"/>
+                </w14:gs>
+              </w14:gsLst>
+              <w14:lin w14:ang="5400000" w14:scaled="0"/>
+            </w14:gradFill>
+          </w14:textFill>
+        </w:rPr>
+        <w:t>SharePoint Framework (</w:t>
+      </w:r>
+      <w:proofErr w:type="spellStart"/>
+      <w:r>
+        <w:rPr>
+          <w:b/>
+          <w:bCs/>
+          <w:color w:val="000000" w:themeColor="text1"/>
+          <w14:textOutline w14:w="0" w14:cap="flat" w14:cmpd="sng" w14:algn="ctr">
+            <w14:noFill/>
+            <w14:prstDash w14:val="solid"/>
+            <w14:round/>
+          </w14:textOutline>
+          <w14:textFill>
+            <w14:gradFill>
+              <w14:gsLst>
+                <w14:gs w14:pos="21000">
+                  <w14:srgbClr w14:val="53575C"/>
+                </w14:gs>
+                <w14:gs w14:pos="88000">
+                  <w14:srgbClr w14:val="C5C7CA"/>
+                </w14:gs>
+              </w14:gsLst>
+              <w14:lin w14:ang="5400000" w14:scaled="0"/>
+            </w14:gradFill>
+          </w14:textFill>
+        </w:rPr>
+        <w:t>SPFx</w:t>
+      </w:r>
+      <w:proofErr w:type="spellEnd"/>
+      <w:r>
+        <w:rPr>
+          <w:b/>
+          <w:bCs/>
+          <w:color w:val="000000" w:themeColor="text1"/>
+          <w14:textOutline w14:w="0" w14:cap="flat" w14:cmpd="sng" w14:algn="ctr">
+            <w14:noFill/>
+            <w14:prstDash w14:val="solid"/>
+            <w14:round/>
+          </w14:textOutline>
+          <w14:textFill>
+            <w14:gradFill>
+              <w14:gsLst>
+                <w14:gs w14:pos="21000">
+                  <w14:srgbClr w14:val="53575C"/>
+                </w14:gs>
+                <w14:gs w14:pos="88000">
+                  <w14:srgbClr w14:val="C5C7CA"/>
+                </w14:gs>
+              </w14:gsLst>
+              <w14:lin w14:ang="5400000" w14:scaled="0"/>
+            </w14:gradFill>
+          </w14:textFill>
+        </w:rPr>
+        <w:t>)</w:t>
+      </w:r>
+      <w:r>
+        <w:rPr>
+          <w:color w:val="000000" w:themeColor="text1"/>
+          <w14:textOutline w14:w="0" w14:cap="flat" w14:cmpd="sng" w14:algn="ctr">
+            <w14:noFill/>
+            <w14:prstDash w14:val="solid"/>
+            <w14:round/>
+          </w14:textOutline>
+          <w14:textFill>
+            <w14:gradFill>
+              <w14:gsLst>
+                <w14:gs w14:pos="21000">
+                  <w14:srgbClr w14:val="53575C"/>
+                </w14:gs>
+                <w14:gs w14:pos="88000">
+                  <w14:srgbClr w14:val="C5C7CA"/>
+                </w14:gs>
+              </w14:gsLst>
+              <w14:lin w14:ang="5400000" w14:scaled="0"/>
+            </w14:gradFill>
+          </w14:textFill>
+        </w:rPr>
+        <w:t xml:space="preserve">, tu dois les </w:t>
+      </w:r>
+      <w:r>
+        <w:rPr>
+          <w:b/>
+          <w:bCs/>
+          <w:color w:val="000000" w:themeColor="text1"/>
+          <w14:textOutline w14:w="0" w14:cap="flat" w14:cmpd="sng" w14:algn="ctr">
+            <w14:noFill/>
+            <w14:prstDash w14:val="solid"/>
+            <w14:round/>
+          </w14:textOutline>
+          <w14:textFill>
+            <w14:gradFill>
+              <w14:gsLst>
+                <w14:gs w14:pos="21000">
+                  <w14:srgbClr w14:val="53575C"/>
+                </w14:gs>
+                <w14:gs w14:pos="88000">
+                  <w14:srgbClr w14:val="C5C7CA"/>
+                </w14:gs>
+              </w14:gsLst>
+              <w14:lin w14:ang="5400000" w14:scaled="0"/>
+            </w14:gradFill>
+          </w14:textFill>
+        </w:rPr>
+        <w:t>héberger et tester</w:t>
+      </w:r>
+      <w:r>
+        <w:rPr>
+          <w:color w:val="000000" w:themeColor="text1"/>
+          <w14:textOutline w14:w="0" w14:cap="flat" w14:cmpd="sng" w14:algn="ctr">
+            <w14:noFill/>
+            <w14:prstDash w14:val="solid"/>
+            <w14:round/>
+          </w14:textOutline>
+          <w14:textFill>
+            <w14:gradFill>
+              <w14:gsLst>
+                <w14:gs w14:pos="21000">
+                  <w14:srgbClr w14:val="53575C"/>
+                </w14:gs>
+                <w14:gs w14:pos="88000">
+                  <w14:srgbClr w14:val="C5C7CA"/>
+                </w14:gs>
+              </w14:gsLst>
+              <w14:lin w14:ang="5400000" w14:scaled="0"/>
+            </w14:gradFill>
+          </w14:textFill>
+        </w:rPr>
+        <w:t xml:space="preserve"> dans un environnement SharePoint. Microsoft ne permet pas de tester directement sans un Tenant SharePoint Online valide.</w:t>
+      </w:r>
+    </w:p>
+    <w:p>
+      <w:pPr>
+        <w:rPr>
+          <w:b/>
+          <w:bCs/>
+          <w:color w:val="000000" w:themeColor="text1"/>
+          <w14:textOutline w14:w="0" w14:cap="flat" w14:cmpd="sng" w14:algn="ctr">
+            <w14:noFill/>
+            <w14:prstDash w14:val="solid"/>
+            <w14:round/>
+          </w14:textOutline>
+          <w14:textFill>
+            <w14:gradFill>
+              <w14:gsLst>
+                <w14:gs w14:pos="21000">
+                  <w14:srgbClr w14:val="53575C"/>
+                </w14:gs>
+                <w14:gs w14:pos="88000">
+                  <w14:srgbClr w14:val="C5C7CA"/>
+                </w14:gs>
+              </w14:gsLst>
+              <w14:lin w14:ang="5400000" w14:scaled="0"/>
+            </w14:gradFill>
+          </w14:textFill>
+        </w:rPr>
+      </w:pPr>
+      <w:r>
+        <w:rPr>
+          <w:b/>
+          <w:bCs/>
+          <w:color w:val="000000" w:themeColor="text1"/>
+          <w14:textOutline w14:w="0" w14:cap="flat" w14:cmpd="sng" w14:algn="ctr">
+            <w14:noFill/>
+            <w14:prstDash w14:val="solid"/>
+            <w14:round/>
+          </w14:textOutline>
+          <w14:textFill>
+            <w14:gradFill>
+              <w14:gsLst>
+                <w14:gs w14:pos="21000">
+                  <w14:srgbClr w14:val="53575C"/>
+                </w14:gs>
+                <w14:gs w14:pos="88000">
+                  <w14:srgbClr w14:val="C5C7CA"/>
+                </w14:gs>
+              </w14:gsLst>
+              <w14:lin w14:ang="5400000" w14:scaled="0"/>
+            </w14:gradFill>
+          </w14:textFill>
+        </w:rPr>
+        <w:t xml:space="preserve">Comment créer un Tenant personnel pour le développement </w:t>
+      </w:r>
+      <w:proofErr w:type="spellStart"/>
+      <w:r>
+        <w:rPr>
+          <w:b/>
+          <w:bCs/>
+          <w:color w:val="000000" w:themeColor="text1"/>
+          <w14:textOutline w14:w="0" w14:cap="flat" w14:cmpd="sng" w14:algn="ctr">
+            <w14:noFill/>
+            <w14:prstDash w14:val="solid"/>
+            <w14:round/>
+          </w14:textOutline>
+          <w14:textFill>
+            <w14:gradFill>
+              <w14:gsLst>
+                <w14:gs w14:pos="21000">
+                  <w14:srgbClr w14:val="53575C"/>
+                </w14:gs>
+                <w14:gs w14:pos="88000">
+                  <w14:srgbClr w14:val="C5C7CA"/>
+                </w14:gs>
+              </w14:gsLst>
+              <w14:lin w14:ang="5400000" w14:scaled="0"/>
+            </w14:gradFill>
+          </w14:textFill>
+        </w:rPr>
+        <w:t>SPFx</w:t>
+      </w:r>
+      <w:proofErr w:type="spellEnd"/>
+      <w:r>
+        <w:rPr>
+          <w:b/>
+          <w:bCs/>
+          <w:color w:val="000000" w:themeColor="text1"/>
+          <w14:textOutline w14:w="0" w14:cap="flat" w14:cmpd="sng" w14:algn="ctr">
+            <w14:noFill/>
+            <w14:prstDash w14:val="solid"/>
+            <w14:round/>
+          </w14:textOutline>
+          <w14:textFill>
+            <w14:gradFill>
+              <w14:gsLst>
+                <w14:gs w14:pos="21000">
+                  <w14:srgbClr w14:val="53575C"/>
+                </w14:gs>
+                <w14:gs w14:pos="88000">
+                  <w14:srgbClr w14:val="C5C7CA"/>
+                </w14:gs>
+              </w14:gsLst>
+              <w14:lin w14:ang="5400000" w14:scaled="0"/>
+            </w14:gradFill>
+          </w14:textFill>
+        </w:rPr>
+        <w:t xml:space="preserve"> ?</w:t>
+      </w:r>
+    </w:p>
+    <w:p>
+      <w:pPr>
+        <w:rPr>
+          <w:b/>
+          <w:bCs/>
+          <w:color w:val="000000" w:themeColor="text1"/>
+          <w14:textOutline w14:w="0" w14:cap="flat" w14:cmpd="sng" w14:algn="ctr">
+            <w14:noFill/>
+            <w14:prstDash w14:val="solid"/>
+            <w14:round/>
+          </w14:textOutline>
+          <w14:textFill>
+            <w14:gradFill>
+              <w14:gsLst>
+                <w14:gs w14:pos="21000">
+                  <w14:srgbClr w14:val="53575C"/>
+                </w14:gs>
+                <w14:gs w14:pos="88000">
+                  <w14:srgbClr w14:val="C5C7CA"/>
+                </w14:gs>
+              </w14:gsLst>
+              <w14:lin w14:ang="5400000" w14:scaled="0"/>
+            </w14:gradFill>
+          </w14:textFill>
+        </w:rPr>
+      </w:pPr>
+      <w:r>
+        <w:rPr>
+          <w:b/>
+          <w:bCs/>
+          <w:color w:val="000000" w:themeColor="text1"/>
+          <w14:textOutline w14:w="0" w14:cap="flat" w14:cmpd="sng" w14:algn="ctr">
+            <w14:noFill/>
+            <w14:prstDash w14:val="solid"/>
+            <w14:round/>
+          </w14:textOutline>
+          <w14:textFill>
+            <w14:gradFill>
+              <w14:gsLst>
+                <w14:gs w14:pos="21000">
+                  <w14:srgbClr w14:val="53575C"/>
+                </w14:gs>
+                <w14:gs w14:pos="88000">
+                  <w14:srgbClr w14:val="C5C7CA"/>
+                </w14:gs>
+              </w14:gsLst>
+              <w14:lin w14:ang="5400000" w14:scaled="0"/>
+            </w14:gradFill>
+          </w14:textFill>
+        </w:rPr>
+        <w:t>1️</w:t>
+      </w:r>
+      <w:r>
+        <w:rPr>
+          <w:rFonts w:ascii="Segoe UI Symbol" w:hAnsi="Segoe UI Symbol" w:cs="Segoe UI Symbol"/>
+          <w:b/>
+          <w:bCs/>
+          <w:color w:val="000000" w:themeColor="text1"/>
+          <w14:textOutline w14:w="0" w14:cap="flat" w14:cmpd="sng" w14:algn="ctr">
+            <w14:noFill/>
+            <w14:prstDash w14:val="solid"/>
+            <w14:round/>
+          </w14:textOutline>
+          <w14:textFill>
+            <w14:gradFill>
+              <w14:gsLst>
+                <w14:gs w14:pos="21000">
+                  <w14:srgbClr w14:val="53575C"/>
+                </w14:gs>
+                <w14:gs w14:pos="88000">
+                  <w14:srgbClr w14:val="C5C7CA"/>
+                </w14:gs>
+              </w14:gsLst>
+              <w14:lin w14:ang="5400000" w14:scaled="0"/>
+            </w14:gradFill>
+          </w14:textFill>
+        </w:rPr>
+        <w:t>⃣</w:t>
+      </w:r>
+      <w:r>
+        <w:rPr>
+          <w:b/>
+          <w:bCs/>
+          <w:color w:val="000000" w:themeColor="text1"/>
+          <w14:textOutline w14:w="0" w14:cap="flat" w14:cmpd="sng" w14:algn="ctr">
+            <w14:noFill/>
+            <w14:prstDash w14:val="solid"/>
+            <w14:round/>
+          </w14:textOutline>
+          <w14:textFill>
+            <w14:gradFill>
+              <w14:gsLst>
+                <w14:gs w14:pos="21000">
+                  <w14:srgbClr w14:val="53575C"/>
+                </w14:gs>
+                <w14:gs w14:pos="88000">
+                  <w14:srgbClr w14:val="C5C7CA"/>
+                </w14:gs>
+              </w14:gsLst>
+              <w14:lin w14:ang="5400000" w14:scaled="0"/>
+            </w14:gradFill>
+          </w14:textFill>
+        </w:rPr>
+        <w:t xml:space="preserve"> Créer un compte Microsoft 365 </w:t>
+      </w:r>
+      <w:proofErr w:type="spellStart"/>
+      <w:r>
+        <w:rPr>
+          <w:b/>
+          <w:bCs/>
+          <w:color w:val="000000" w:themeColor="text1"/>
+          <w14:textOutline w14:w="0" w14:cap="flat" w14:cmpd="sng" w14:algn="ctr">
+            <w14:noFill/>
+            <w14:prstDash w14:val="solid"/>
+            <w14:round/>
+          </w14:textOutline>
+          <w14:textFill>
+            <w14:gradFill>
+              <w14:gsLst>
+                <w14:gs w14:pos="21000">
+                  <w14:srgbClr w14:val="53575C"/>
+                </w14:gs>
+                <w14:gs w14:pos="88000">
+                  <w14:srgbClr w14:val="C5C7CA"/>
+                </w14:gs>
+              </w14:gsLst>
+              <w14:lin w14:ang="5400000" w14:scaled="0"/>
+            </w14:gradFill>
+          </w14:textFill>
+        </w:rPr>
+        <w:t>Developer</w:t>
+      </w:r>
+      <w:proofErr w:type="spellEnd"/>
+      <w:r>
+        <w:rPr>
+          <w:b/>
+          <w:bCs/>
+          <w:color w:val="000000" w:themeColor="text1"/>
+          <w14:textOutline w14:w="0" w14:cap="flat" w14:cmpd="sng" w14:algn="ctr">
+            <w14:noFill/>
+            <w14:prstDash w14:val="solid"/>
+            <w14:round/>
+          </w14:textOutline>
+          <w14:textFill>
+            <w14:gradFill>
+              <w14:gsLst>
+                <w14:gs w14:pos="21000">
+                  <w14:srgbClr w14:val="53575C"/>
+                </w14:gs>
+                <w14:gs w14:pos="88000">
+                  <w14:srgbClr w14:val="C5C7CA"/>
+                </w14:gs>
+              </w14:gsLst>
+              <w14:lin w14:ang="5400000" w14:scaled="0"/>
+            </w14:gradFill>
+          </w14:textFill>
+        </w:rPr>
+        <w:t xml:space="preserve"> Program</w:t>
+      </w:r>
+    </w:p>
+    <w:p>
+      <w:pPr>
+        <w:rPr>
+          <w:color w:val="000000" w:themeColor="text1"/>
+          <w14:textOutline w14:w="0" w14:cap="flat" w14:cmpd="sng" w14:algn="ctr">
+            <w14:noFill/>
+            <w14:prstDash w14:val="solid"/>
+            <w14:round/>
+          </w14:textOutline>
+          <w14:textFill>
+            <w14:gradFill>
+              <w14:gsLst>
+                <w14:gs w14:pos="21000">
+                  <w14:srgbClr w14:val="53575C"/>
+                </w14:gs>
+                <w14:gs w14:pos="88000">
+                  <w14:srgbClr w14:val="C5C7CA"/>
+                </w14:gs>
+              </w14:gsLst>
+              <w14:lin w14:ang="5400000" w14:scaled="0"/>
+            </w14:gradFill>
+          </w14:textFill>
+        </w:rPr>
+      </w:pPr>
+      <w:r>
+        <w:rPr>
+          <w:color w:val="000000" w:themeColor="text1"/>
+          <w14:textOutline w14:w="0" w14:cap="flat" w14:cmpd="sng" w14:algn="ctr">
+            <w14:noFill/>
+            <w14:prstDash w14:val="solid"/>
+            <w14:round/>
+          </w14:textOutline>
+          <w14:textFill>
+            <w14:gradFill>
+              <w14:gsLst>
+                <w14:gs w14:pos="21000">
+                  <w14:srgbClr w14:val="53575C"/>
+                </w14:gs>
+                <w14:gs w14:pos="88000">
+                  <w14:srgbClr w14:val="C5C7CA"/>
+                </w14:gs>
+              </w14:gsLst>
+              <w14:lin w14:ang="5400000" w14:scaled="0"/>
+            </w14:gradFill>
+          </w14:textFill>
+        </w:rPr>
+        <w:t xml:space="preserve">Microsoft offre un </w:t>
+      </w:r>
+      <w:r>
+        <w:rPr>
+          <w:b/>
+          <w:bCs/>
+          <w:color w:val="000000" w:themeColor="text1"/>
+          <w14:textOutline w14:w="0" w14:cap="flat" w14:cmpd="sng" w14:algn="ctr">
+            <w14:noFill/>
+            <w14:prstDash w14:val="solid"/>
+            <w14:round/>
+          </w14:textOutline>
+          <w14:textFill>
+            <w14:gradFill>
+              <w14:gsLst>
+                <w14:gs w14:pos="21000">
+                  <w14:srgbClr w14:val="53575C"/>
+                </w14:gs>
+                <w14:gs w14:pos="88000">
+                  <w14:srgbClr w14:val="C5C7CA"/>
+                </w14:gs>
+              </w14:gsLst>
+              <w14:lin w14:ang="5400000" w14:scaled="0"/>
+            </w14:gradFill>
+          </w14:textFill>
+        </w:rPr>
+        <w:t>environnement de test gratuit</w:t>
+      </w:r>
+      <w:r>
+        <w:rPr>
+          <w:color w:val="000000" w:themeColor="text1"/>
+          <w14:textOutline w14:w="0" w14:cap="flat" w14:cmpd="sng" w14:algn="ctr">
+            <w14:noFill/>
+            <w14:prstDash w14:val="solid"/>
+            <w14:round/>
+          </w14:textOutline>
+          <w14:textFill>
+            <w14:gradFill>
+              <w14:gsLst>
+                <w14:gs w14:pos="21000">
+                  <w14:srgbClr w14:val="53575C"/>
+                </w14:gs>
+                <w14:gs w14:pos="88000">
+                  <w14:srgbClr w14:val="C5C7CA"/>
+                </w14:gs>
+              </w14:gsLst>
+              <w14:lin w14:ang="5400000" w14:scaled="0"/>
+            </w14:gradFill>
+          </w14:textFill>
+        </w:rPr>
+        <w:t xml:space="preserve"> aux développeurs qui souhaitent créer des solutions SharePoint, Teams, et Power Platform.</w:t>
+      </w:r>
+    </w:p>
+    <w:p>
+      <w:pPr>
+        <w:rPr>
+          <w:color w:val="000000" w:themeColor="text1"/>
+          <w14:textOutline w14:w="0" w14:cap="flat" w14:cmpd="sng" w14:algn="ctr">
+            <w14:noFill/>
+            <w14:prstDash w14:val="solid"/>
+            <w14:round/>
+          </w14:textOutline>
+          <w14:textFill>
+            <w14:gradFill>
+              <w14:gsLst>
+                <w14:gs w14:pos="21000">
+                  <w14:srgbClr w14:val="53575C"/>
+                </w14:gs>
+                <w14:gs w14:pos="88000">
+                  <w14:srgbClr w14:val="C5C7CA"/>
+                </w14:gs>
+              </w14:gsLst>
+              <w14:lin w14:ang="5400000" w14:scaled="0"/>
+            </w14:gradFill>
+          </w14:textFill>
+        </w:rPr>
+      </w:pPr>
+      <w:r>
+        <w:rPr>
+          <w:rFonts w:ascii="Segoe UI Emoji" w:hAnsi="Segoe UI Emoji" w:cs="Segoe UI Emoji"/>
+          <w:color w:val="000000" w:themeColor="text1"/>
+          <w14:textOutline w14:w="0" w14:cap="flat" w14:cmpd="sng" w14:algn="ctr">
+            <w14:noFill/>
+            <w14:prstDash w14:val="solid"/>
+            <w14:round/>
+          </w14:textOutline>
+          <w14:textFill>
+            <w14:gradFill>
+              <w14:gsLst>
+                <w14:gs w14:pos="21000">
+                  <w14:srgbClr w14:val="53575C"/>
+                </w14:gs>
+                <w14:gs w14:pos="88000">
+                  <w14:srgbClr w14:val="C5C7CA"/>
+                </w14:gs>
+              </w14:gsLst>
+              <w14:lin w14:ang="5400000" w14:scaled="0"/>
+            </w14:gradFill>
+          </w14:textFill>
+        </w:rPr>
+        <w:lastRenderedPageBreak/>
+        <w:t>👉</w:t>
+      </w:r>
+      <w:r>
+        <w:rPr>
+          <w:color w:val="000000" w:themeColor="text1"/>
+          <w14:textOutline w14:w="0" w14:cap="flat" w14:cmpd="sng" w14:algn="ctr">
+            <w14:noFill/>
+            <w14:prstDash w14:val="solid"/>
+            <w14:round/>
+          </w14:textOutline>
+          <w14:textFill>
+            <w14:gradFill>
+              <w14:gsLst>
+                <w14:gs w14:pos="21000">
+                  <w14:srgbClr w14:val="53575C"/>
+                </w14:gs>
+                <w14:gs w14:pos="88000">
+                  <w14:srgbClr w14:val="C5C7CA"/>
+                </w14:gs>
+              </w14:gsLst>
+              <w14:lin w14:ang="5400000" w14:scaled="0"/>
+            </w14:gradFill>
+          </w14:textFill>
+        </w:rPr>
+        <w:t xml:space="preserve"> </w:t>
+      </w:r>
+      <w:r>
+        <w:rPr>
+          <w:b/>
+          <w:bCs/>
+          <w:color w:val="000000" w:themeColor="text1"/>
+          <w14:textOutline w14:w="0" w14:cap="flat" w14:cmpd="sng" w14:algn="ctr">
+            <w14:noFill/>
+            <w14:prstDash w14:val="solid"/>
+            <w14:round/>
+          </w14:textOutline>
+          <w14:textFill>
+            <w14:gradFill>
+              <w14:gsLst>
+                <w14:gs w14:pos="21000">
+                  <w14:srgbClr w14:val="53575C"/>
+                </w14:gs>
+                <w14:gs w14:pos="88000">
+                  <w14:srgbClr w14:val="C5C7CA"/>
+                </w14:gs>
+              </w14:gsLst>
+              <w14:lin w14:ang="5400000" w14:scaled="0"/>
+            </w14:gradFill>
+          </w14:textFill>
+        </w:rPr>
+        <w:t>Inscription gratuite ici</w:t>
+      </w:r>
+      <w:r>
+        <w:rPr>
+          <w:color w:val="000000" w:themeColor="text1"/>
+          <w14:textOutline w14:w="0" w14:cap="flat" w14:cmpd="sng" w14:algn="ctr">
+            <w14:noFill/>
+            <w14:prstDash w14:val="solid"/>
+            <w14:round/>
+          </w14:textOutline>
+          <w14:textFill>
+            <w14:gradFill>
+              <w14:gsLst>
+                <w14:gs w14:pos="21000">
+                  <w14:srgbClr w14:val="53575C"/>
+                </w14:gs>
+                <w14:gs w14:pos="88000">
+                  <w14:srgbClr w14:val="C5C7CA"/>
+                </w14:gs>
+              </w14:gsLst>
+              <w14:lin w14:ang="5400000" w14:scaled="0"/>
+            </w14:gradFill>
+          </w14:textFill>
+        </w:rPr>
+        <w:t xml:space="preserve"> :</w:t>
+      </w:r>
+      <w:r>
+        <w:rPr>
+          <w:color w:val="000000" w:themeColor="text1"/>
+          <w14:textOutline w14:w="0" w14:cap="flat" w14:cmpd="sng" w14:algn="ctr">
+            <w14:noFill/>
+            <w14:prstDash w14:val="solid"/>
+            <w14:round/>
+          </w14:textOutline>
+          <w14:textFill>
+            <w14:gradFill>
+              <w14:gsLst>
+                <w14:gs w14:pos="21000">
+                  <w14:srgbClr w14:val="53575C"/>
+                </w14:gs>
+                <w14:gs w14:pos="88000">
+                  <w14:srgbClr w14:val="C5C7CA"/>
+                </w14:gs>
+              </w14:gsLst>
+              <w14:lin w14:ang="5400000" w14:scaled="0"/>
+            </w14:gradFill>
+          </w14:textFill>
+        </w:rPr>
+        <w:br/>
+      </w:r>
+      <w:r>
+        <w:rPr>
+          <w:rFonts w:ascii="Segoe UI Emoji" w:hAnsi="Segoe UI Emoji" w:cs="Segoe UI Emoji"/>
+          <w:color w:val="000000" w:themeColor="text1"/>
+          <w14:textOutline w14:w="0" w14:cap="flat" w14:cmpd="sng" w14:algn="ctr">
+            <w14:noFill/>
+            <w14:prstDash w14:val="solid"/>
+            <w14:round/>
+          </w14:textOutline>
+          <w14:textFill>
+            <w14:gradFill>
+              <w14:gsLst>
+                <w14:gs w14:pos="21000">
+                  <w14:srgbClr w14:val="53575C"/>
+                </w14:gs>
+                <w14:gs w14:pos="88000">
+                  <w14:srgbClr w14:val="C5C7CA"/>
+                </w14:gs>
+              </w14:gsLst>
+              <w14:lin w14:ang="5400000" w14:scaled="0"/>
+            </w14:gradFill>
+          </w14:textFill>
+        </w:rPr>
+        <w:t>🔗</w:t>
+      </w:r>
+      <w:r>
+        <w:rPr>
+          <w:color w:val="000000" w:themeColor="text1"/>
+          <w14:textOutline w14:w="0" w14:cap="flat" w14:cmpd="sng" w14:algn="ctr">
+            <w14:noFill/>
+            <w14:prstDash w14:val="solid"/>
+            <w14:round/>
+          </w14:textOutline>
+          <w14:textFill>
+            <w14:gradFill>
+              <w14:gsLst>
+                <w14:gs w14:pos="21000">
+                  <w14:srgbClr w14:val="53575C"/>
+                </w14:gs>
+                <w14:gs w14:pos="88000">
+                  <w14:srgbClr w14:val="C5C7CA"/>
+                </w14:gs>
+              </w14:gsLst>
+              <w14:lin w14:ang="5400000" w14:scaled="0"/>
+            </w14:gradFill>
+          </w14:textFill>
+        </w:rPr>
+        <w:t xml:space="preserve"> </w:t>
+      </w:r>
+      <w:hyperlink r:id="rId5" w:tgtFrame="_new" w:history="1">
+        <w:r>
+          <w:rPr>
+            <w:rStyle w:val="Lienhypertexte"/>
+            <w14:textOutline w14:w="0" w14:cap="flat" w14:cmpd="sng" w14:algn="ctr">
+              <w14:noFill/>
+              <w14:prstDash w14:val="solid"/>
+              <w14:round/>
+            </w14:textOutline>
+            <w14:textFill>
+              <w14:gradFill>
+                <w14:gsLst>
+                  <w14:gs w14:pos="21000">
+                    <w14:srgbClr w14:val="53575C"/>
+                  </w14:gs>
+                  <w14:gs w14:pos="88000">
+                    <w14:srgbClr w14:val="C5C7CA"/>
+                  </w14:gs>
+                </w14:gsLst>
+                <w14:lin w14:ang="5400000" w14:scaled="0"/>
+              </w14:gradFill>
+            </w14:textFill>
+          </w:rPr>
+          <w:t>https://developer.microsoft.com/en-us/microsoft-365/dev-program</w:t>
+        </w:r>
+      </w:hyperlink>
+    </w:p>
+    <w:p>
+      <w:pPr>
+        <w:numPr>
+          <w:ilvl w:val="0"/>
+          <w:numId w:val="9"/>
+        </w:numPr>
+        <w:rPr>
+          <w:color w:val="000000" w:themeColor="text1"/>
+          <w14:textOutline w14:w="0" w14:cap="flat" w14:cmpd="sng" w14:algn="ctr">
+            <w14:noFill/>
+            <w14:prstDash w14:val="solid"/>
+            <w14:round/>
+          </w14:textOutline>
+          <w14:textFill>
+            <w14:gradFill>
+              <w14:gsLst>
+                <w14:gs w14:pos="21000">
+                  <w14:srgbClr w14:val="53575C"/>
+                </w14:gs>
+                <w14:gs w14:pos="88000">
+                  <w14:srgbClr w14:val="C5C7CA"/>
+                </w14:gs>
+              </w14:gsLst>
+              <w14:lin w14:ang="5400000" w14:scaled="0"/>
+            </w14:gradFill>
+          </w14:textFill>
+        </w:rPr>
+      </w:pPr>
+      <w:r>
+        <w:rPr>
+          <w:color w:val="000000" w:themeColor="text1"/>
+          <w14:textOutline w14:w="0" w14:cap="flat" w14:cmpd="sng" w14:algn="ctr">
+            <w14:noFill/>
+            <w14:prstDash w14:val="solid"/>
+            <w14:round/>
+          </w14:textOutline>
+          <w14:textFill>
+            <w14:gradFill>
+              <w14:gsLst>
+                <w14:gs w14:pos="21000">
+                  <w14:srgbClr w14:val="53575C"/>
+                </w14:gs>
+                <w14:gs w14:pos="88000">
+                  <w14:srgbClr w14:val="C5C7CA"/>
+                </w14:gs>
+              </w14:gsLst>
+              <w14:lin w14:ang="5400000" w14:scaled="0"/>
+            </w14:gradFill>
+          </w14:textFill>
+        </w:rPr>
+        <w:t xml:space="preserve">Clique sur </w:t>
+      </w:r>
+      <w:r>
+        <w:rPr>
+          <w:b/>
+          <w:bCs/>
+          <w:color w:val="000000" w:themeColor="text1"/>
+          <w14:textOutline w14:w="0" w14:cap="flat" w14:cmpd="sng" w14:algn="ctr">
+            <w14:noFill/>
+            <w14:prstDash w14:val="solid"/>
+            <w14:round/>
+          </w14:textOutline>
+          <w14:textFill>
+            <w14:gradFill>
+              <w14:gsLst>
+                <w14:gs w14:pos="21000">
+                  <w14:srgbClr w14:val="53575C"/>
+                </w14:gs>
+                <w14:gs w14:pos="88000">
+                  <w14:srgbClr w14:val="C5C7CA"/>
+                </w14:gs>
+              </w14:gsLst>
+              <w14:lin w14:ang="5400000" w14:scaled="0"/>
+            </w14:gradFill>
+          </w14:textFill>
+        </w:rPr>
+        <w:t>"</w:t>
+      </w:r>
+      <w:proofErr w:type="spellStart"/>
+      <w:r>
+        <w:rPr>
+          <w:b/>
+          <w:bCs/>
+          <w:color w:val="000000" w:themeColor="text1"/>
+          <w14:textOutline w14:w="0" w14:cap="flat" w14:cmpd="sng" w14:algn="ctr">
+            <w14:noFill/>
+            <w14:prstDash w14:val="solid"/>
+            <w14:round/>
+          </w14:textOutline>
+          <w14:textFill>
+            <w14:gradFill>
+              <w14:gsLst>
+                <w14:gs w14:pos="21000">
+                  <w14:srgbClr w14:val="53575C"/>
+                </w14:gs>
+                <w14:gs w14:pos="88000">
+                  <w14:srgbClr w14:val="C5C7CA"/>
+                </w14:gs>
+              </w14:gsLst>
+              <w14:lin w14:ang="5400000" w14:scaled="0"/>
+            </w14:gradFill>
+          </w14:textFill>
+        </w:rPr>
+        <w:t>Join</w:t>
+      </w:r>
+      <w:proofErr w:type="spellEnd"/>
+      <w:r>
+        <w:rPr>
+          <w:b/>
+          <w:bCs/>
+          <w:color w:val="000000" w:themeColor="text1"/>
+          <w14:textOutline w14:w="0" w14:cap="flat" w14:cmpd="sng" w14:algn="ctr">
+            <w14:noFill/>
+            <w14:prstDash w14:val="solid"/>
+            <w14:round/>
+          </w14:textOutline>
+          <w14:textFill>
+            <w14:gradFill>
+              <w14:gsLst>
+                <w14:gs w14:pos="21000">
+                  <w14:srgbClr w14:val="53575C"/>
+                </w14:gs>
+                <w14:gs w14:pos="88000">
+                  <w14:srgbClr w14:val="C5C7CA"/>
+                </w14:gs>
+              </w14:gsLst>
+              <w14:lin w14:ang="5400000" w14:scaled="0"/>
+            </w14:gradFill>
+          </w14:textFill>
+        </w:rPr>
+        <w:t xml:space="preserve"> </w:t>
+      </w:r>
+      <w:proofErr w:type="spellStart"/>
+      <w:r>
+        <w:rPr>
+          <w:b/>
+          <w:bCs/>
+          <w:color w:val="000000" w:themeColor="text1"/>
+          <w14:textOutline w14:w="0" w14:cap="flat" w14:cmpd="sng" w14:algn="ctr">
+            <w14:noFill/>
+            <w14:prstDash w14:val="solid"/>
+            <w14:round/>
+          </w14:textOutline>
+          <w14:textFill>
+            <w14:gradFill>
+              <w14:gsLst>
+                <w14:gs w14:pos="21000">
+                  <w14:srgbClr w14:val="53575C"/>
+                </w14:gs>
+                <w14:gs w14:pos="88000">
+                  <w14:srgbClr w14:val="C5C7CA"/>
+                </w14:gs>
+              </w14:gsLst>
+              <w14:lin w14:ang="5400000" w14:scaled="0"/>
+            </w14:gradFill>
+          </w14:textFill>
+        </w:rPr>
+        <w:t>Now</w:t>
+      </w:r>
+      <w:proofErr w:type="spellEnd"/>
+      <w:r>
+        <w:rPr>
+          <w:b/>
+          <w:bCs/>
+          <w:color w:val="000000" w:themeColor="text1"/>
+          <w14:textOutline w14:w="0" w14:cap="flat" w14:cmpd="sng" w14:algn="ctr">
+            <w14:noFill/>
+            <w14:prstDash w14:val="solid"/>
+            <w14:round/>
+          </w14:textOutline>
+          <w14:textFill>
+            <w14:gradFill>
+              <w14:gsLst>
+                <w14:gs w14:pos="21000">
+                  <w14:srgbClr w14:val="53575C"/>
+                </w14:gs>
+                <w14:gs w14:pos="88000">
+                  <w14:srgbClr w14:val="C5C7CA"/>
+                </w14:gs>
+              </w14:gsLst>
+              <w14:lin w14:ang="5400000" w14:scaled="0"/>
+            </w14:gradFill>
+          </w14:textFill>
+        </w:rPr>
+        <w:t>"</w:t>
+      </w:r>
+    </w:p>
+    <w:p>
+      <w:pPr>
+        <w:numPr>
+          <w:ilvl w:val="0"/>
+          <w:numId w:val="9"/>
+        </w:numPr>
+        <w:rPr>
+          <w:color w:val="000000" w:themeColor="text1"/>
+          <w14:textOutline w14:w="0" w14:cap="flat" w14:cmpd="sng" w14:algn="ctr">
+            <w14:noFill/>
+            <w14:prstDash w14:val="solid"/>
+            <w14:round/>
+          </w14:textOutline>
+          <w14:textFill>
+            <w14:gradFill>
+              <w14:gsLst>
+                <w14:gs w14:pos="21000">
+                  <w14:srgbClr w14:val="53575C"/>
+                </w14:gs>
+                <w14:gs w14:pos="88000">
+                  <w14:srgbClr w14:val="C5C7CA"/>
+                </w14:gs>
+              </w14:gsLst>
+              <w14:lin w14:ang="5400000" w14:scaled="0"/>
+            </w14:gradFill>
+          </w14:textFill>
+        </w:rPr>
+      </w:pPr>
+      <w:r>
+        <w:rPr>
+          <w:color w:val="000000" w:themeColor="text1"/>
+          <w14:textOutline w14:w="0" w14:cap="flat" w14:cmpd="sng" w14:algn="ctr">
+            <w14:noFill/>
+            <w14:prstDash w14:val="solid"/>
+            <w14:round/>
+          </w14:textOutline>
+          <w14:textFill>
+            <w14:gradFill>
+              <w14:gsLst>
+                <w14:gs w14:pos="21000">
+                  <w14:srgbClr w14:val="53575C"/>
+                </w14:gs>
+                <w14:gs w14:pos="88000">
+                  <w14:srgbClr w14:val="C5C7CA"/>
+                </w14:gs>
+              </w14:gsLst>
+              <w14:lin w14:ang="5400000" w14:scaled="0"/>
+            </w14:gradFill>
+          </w14:textFill>
+        </w:rPr>
+        <w:t>Connecte-toi avec un compte Microsoft (ou crée-en un si nécessaire)</w:t>
+      </w:r>
+    </w:p>
+    <w:p>
+      <w:pPr>
+        <w:numPr>
+          <w:ilvl w:val="0"/>
+          <w:numId w:val="9"/>
+        </w:numPr>
+        <w:rPr>
+          <w:color w:val="000000" w:themeColor="text1"/>
+          <w14:textOutline w14:w="0" w14:cap="flat" w14:cmpd="sng" w14:algn="ctr">
+            <w14:noFill/>
+            <w14:prstDash w14:val="solid"/>
+            <w14:round/>
+          </w14:textOutline>
+          <w14:textFill>
+            <w14:gradFill>
+              <w14:gsLst>
+                <w14:gs w14:pos="21000">
+                  <w14:srgbClr w14:val="53575C"/>
+                </w14:gs>
+                <w14:gs w14:pos="88000">
+                  <w14:srgbClr w14:val="C5C7CA"/>
+                </w14:gs>
+              </w14:gsLst>
+              <w14:lin w14:ang="5400000" w14:scaled="0"/>
+            </w14:gradFill>
+          </w14:textFill>
+        </w:rPr>
+      </w:pPr>
+      <w:r>
+        <w:rPr>
+          <w:color w:val="000000" w:themeColor="text1"/>
+          <w14:textOutline w14:w="0" w14:cap="flat" w14:cmpd="sng" w14:algn="ctr">
+            <w14:noFill/>
+            <w14:prstDash w14:val="solid"/>
+            <w14:round/>
+          </w14:textOutline>
+          <w14:textFill>
+            <w14:gradFill>
+              <w14:gsLst>
+                <w14:gs w14:pos="21000">
+                  <w14:srgbClr w14:val="53575C"/>
+                </w14:gs>
+                <w14:gs w14:pos="88000">
+                  <w14:srgbClr w14:val="C5C7CA"/>
+                </w14:gs>
+              </w14:gsLst>
+              <w14:lin w14:ang="5400000" w14:scaled="0"/>
+            </w14:gradFill>
+          </w14:textFill>
+        </w:rPr>
+        <w:t xml:space="preserve">Remplis le formulaire avec ton rôle (ex. </w:t>
+      </w:r>
+      <w:proofErr w:type="spellStart"/>
+      <w:r>
+        <w:rPr>
+          <w:color w:val="000000" w:themeColor="text1"/>
+          <w14:textOutline w14:w="0" w14:cap="flat" w14:cmpd="sng" w14:algn="ctr">
+            <w14:noFill/>
+            <w14:prstDash w14:val="solid"/>
+            <w14:round/>
+          </w14:textOutline>
+          <w14:textFill>
+            <w14:gradFill>
+              <w14:gsLst>
+                <w14:gs w14:pos="21000">
+                  <w14:srgbClr w14:val="53575C"/>
+                </w14:gs>
+                <w14:gs w14:pos="88000">
+                  <w14:srgbClr w14:val="C5C7CA"/>
+                </w14:gs>
+              </w14:gsLst>
+              <w14:lin w14:ang="5400000" w14:scaled="0"/>
+            </w14:gradFill>
+          </w14:textFill>
+        </w:rPr>
+        <w:t>Developer</w:t>
+      </w:r>
+      <w:proofErr w:type="spellEnd"/>
+      <w:r>
+        <w:rPr>
+          <w:color w:val="000000" w:themeColor="text1"/>
+          <w14:textOutline w14:w="0" w14:cap="flat" w14:cmpd="sng" w14:algn="ctr">
+            <w14:noFill/>
+            <w14:prstDash w14:val="solid"/>
+            <w14:round/>
+          </w14:textOutline>
+          <w14:textFill>
+            <w14:gradFill>
+              <w14:gsLst>
+                <w14:gs w14:pos="21000">
+                  <w14:srgbClr w14:val="53575C"/>
+                </w14:gs>
+                <w14:gs w14:pos="88000">
+                  <w14:srgbClr w14:val="C5C7CA"/>
+                </w14:gs>
+              </w14:gsLst>
+              <w14:lin w14:ang="5400000" w14:scaled="0"/>
+            </w14:gradFill>
+          </w14:textFill>
+        </w:rPr>
+        <w:t>, IT Admin)</w:t>
+      </w:r>
+    </w:p>
+    <w:p>
+      <w:pPr>
+        <w:numPr>
+          <w:ilvl w:val="0"/>
+          <w:numId w:val="9"/>
+        </w:numPr>
+        <w:rPr>
+          <w:color w:val="000000" w:themeColor="text1"/>
+          <w14:textOutline w14:w="0" w14:cap="flat" w14:cmpd="sng" w14:algn="ctr">
+            <w14:noFill/>
+            <w14:prstDash w14:val="solid"/>
+            <w14:round/>
+          </w14:textOutline>
+          <w14:textFill>
+            <w14:gradFill>
+              <w14:gsLst>
+                <w14:gs w14:pos="21000">
+                  <w14:srgbClr w14:val="53575C"/>
+                </w14:gs>
+                <w14:gs w14:pos="88000">
+                  <w14:srgbClr w14:val="C5C7CA"/>
+                </w14:gs>
+              </w14:gsLst>
+              <w14:lin w14:ang="5400000" w14:scaled="0"/>
+            </w14:gradFill>
+          </w14:textFill>
+        </w:rPr>
+      </w:pPr>
+      <w:r>
+        <w:rPr>
+          <w:color w:val="000000" w:themeColor="text1"/>
+          <w14:textOutline w14:w="0" w14:cap="flat" w14:cmpd="sng" w14:algn="ctr">
+            <w14:noFill/>
+            <w14:prstDash w14:val="solid"/>
+            <w14:round/>
+          </w14:textOutline>
+          <w14:textFill>
+            <w14:gradFill>
+              <w14:gsLst>
+                <w14:gs w14:pos="21000">
+                  <w14:srgbClr w14:val="53575C"/>
+                </w14:gs>
+                <w14:gs w14:pos="88000">
+                  <w14:srgbClr w14:val="C5C7CA"/>
+                </w14:gs>
+              </w14:gsLst>
+              <w14:lin w14:ang="5400000" w14:scaled="0"/>
+            </w14:gradFill>
+          </w14:textFill>
+        </w:rPr>
+        <w:t>Accepte les conditions et termine l'inscription</w:t>
+      </w:r>
+    </w:p>
+    <w:p>
+      <w:pPr>
+        <w:rPr>
+          <w:b/>
+          <w:bCs/>
+          <w:color w:val="000000" w:themeColor="text1"/>
+          <w14:textOutline w14:w="0" w14:cap="flat" w14:cmpd="sng" w14:algn="ctr">
+            <w14:noFill/>
+            <w14:prstDash w14:val="solid"/>
+            <w14:round/>
+          </w14:textOutline>
+          <w14:textFill>
+            <w14:gradFill>
+              <w14:gsLst>
+                <w14:gs w14:pos="21000">
+                  <w14:srgbClr w14:val="53575C"/>
+                </w14:gs>
+                <w14:gs w14:pos="88000">
+                  <w14:srgbClr w14:val="C5C7CA"/>
+                </w14:gs>
+              </w14:gsLst>
+              <w14:lin w14:ang="5400000" w14:scaled="0"/>
+            </w14:gradFill>
+          </w14:textFill>
+        </w:rPr>
+      </w:pPr>
+      <w:r>
+        <w:rPr>
+          <w:b/>
+          <w:bCs/>
+          <w:color w:val="000000" w:themeColor="text1"/>
+          <w14:textOutline w14:w="0" w14:cap="flat" w14:cmpd="sng" w14:algn="ctr">
+            <w14:noFill/>
+            <w14:prstDash w14:val="solid"/>
+            <w14:round/>
+          </w14:textOutline>
+          <w14:textFill>
+            <w14:gradFill>
+              <w14:gsLst>
+                <w14:gs w14:pos="21000">
+                  <w14:srgbClr w14:val="53575C"/>
+                </w14:gs>
+                <w14:gs w14:pos="88000">
+                  <w14:srgbClr w14:val="C5C7CA"/>
+                </w14:gs>
+              </w14:gsLst>
+              <w14:lin w14:ang="5400000" w14:scaled="0"/>
+            </w14:gradFill>
+          </w14:textFill>
+        </w:rPr>
+        <w:t>2️</w:t>
+      </w:r>
+      <w:r>
+        <w:rPr>
+          <w:rFonts w:ascii="Segoe UI Symbol" w:hAnsi="Segoe UI Symbol" w:cs="Segoe UI Symbol"/>
+          <w:b/>
+          <w:bCs/>
+          <w:color w:val="000000" w:themeColor="text1"/>
+          <w14:textOutline w14:w="0" w14:cap="flat" w14:cmpd="sng" w14:algn="ctr">
+            <w14:noFill/>
+            <w14:prstDash w14:val="solid"/>
+            <w14:round/>
+          </w14:textOutline>
+          <w14:textFill>
+            <w14:gradFill>
+              <w14:gsLst>
+                <w14:gs w14:pos="21000">
+                  <w14:srgbClr w14:val="53575C"/>
+                </w14:gs>
+                <w14:gs w14:pos="88000">
+                  <w14:srgbClr w14:val="C5C7CA"/>
+                </w14:gs>
+              </w14:gsLst>
+              <w14:lin w14:ang="5400000" w14:scaled="0"/>
+            </w14:gradFill>
+          </w14:textFill>
+        </w:rPr>
+        <w:t>⃣</w:t>
+      </w:r>
+      <w:r>
+        <w:rPr>
+          <w:b/>
+          <w:bCs/>
+          <w:color w:val="000000" w:themeColor="text1"/>
+          <w14:textOutline w14:w="0" w14:cap="flat" w14:cmpd="sng" w14:algn="ctr">
+            <w14:noFill/>
+            <w14:prstDash w14:val="solid"/>
+            <w14:round/>
+          </w14:textOutline>
+          <w14:textFill>
+            <w14:gradFill>
+              <w14:gsLst>
+                <w14:gs w14:pos="21000">
+                  <w14:srgbClr w14:val="53575C"/>
+                </w14:gs>
+                <w14:gs w14:pos="88000">
+                  <w14:srgbClr w14:val="C5C7CA"/>
+                </w14:gs>
+              </w14:gsLst>
+              <w14:lin w14:ang="5400000" w14:scaled="0"/>
+            </w14:gradFill>
+          </w14:textFill>
+        </w:rPr>
+        <w:t xml:space="preserve"> Configurer ton Tenant Microsoft 365</w:t>
+      </w:r>
+    </w:p>
+    <w:p>
+      <w:pPr>
+        <w:rPr>
+          <w:color w:val="000000" w:themeColor="text1"/>
+          <w14:textOutline w14:w="0" w14:cap="flat" w14:cmpd="sng" w14:algn="ctr">
+            <w14:noFill/>
+            <w14:prstDash w14:val="solid"/>
+            <w14:round/>
+          </w14:textOutline>
+          <w14:textFill>
+            <w14:gradFill>
+              <w14:gsLst>
+                <w14:gs w14:pos="21000">
+                  <w14:srgbClr w14:val="53575C"/>
+                </w14:gs>
+                <w14:gs w14:pos="88000">
+                  <w14:srgbClr w14:val="C5C7CA"/>
+                </w14:gs>
+              </w14:gsLst>
+              <w14:lin w14:ang="5400000" w14:scaled="0"/>
+            </w14:gradFill>
+          </w14:textFill>
+        </w:rPr>
+      </w:pPr>
+      <w:r>
+        <w:rPr>
+          <w:color w:val="000000" w:themeColor="text1"/>
+          <w14:textOutline w14:w="0" w14:cap="flat" w14:cmpd="sng" w14:algn="ctr">
+            <w14:noFill/>
+            <w14:prstDash w14:val="solid"/>
+            <w14:round/>
+          </w14:textOutline>
+          <w14:textFill>
+            <w14:gradFill>
+              <w14:gsLst>
+                <w14:gs w14:pos="21000">
+                  <w14:srgbClr w14:val="53575C"/>
+                </w14:gs>
+                <w14:gs w14:pos="88000">
+                  <w14:srgbClr w14:val="C5C7CA"/>
+                </w14:gs>
+              </w14:gsLst>
+              <w14:lin w14:ang="5400000" w14:scaled="0"/>
+            </w14:gradFill>
+          </w14:textFill>
+        </w:rPr>
+        <w:t xml:space="preserve">Après l'inscription, tu peux </w:t>
+      </w:r>
+      <w:r>
+        <w:rPr>
+          <w:b/>
+          <w:bCs/>
+          <w:color w:val="000000" w:themeColor="text1"/>
+          <w14:textOutline w14:w="0" w14:cap="flat" w14:cmpd="sng" w14:algn="ctr">
+            <w14:noFill/>
+            <w14:prstDash w14:val="solid"/>
+            <w14:round/>
+          </w14:textOutline>
+          <w14:textFill>
+            <w14:gradFill>
+              <w14:gsLst>
+                <w14:gs w14:pos="21000">
+                  <w14:srgbClr w14:val="53575C"/>
+                </w14:gs>
+                <w14:gs w14:pos="88000">
+                  <w14:srgbClr w14:val="C5C7CA"/>
+                </w14:gs>
+              </w14:gsLst>
+              <w14:lin w14:ang="5400000" w14:scaled="0"/>
+            </w14:gradFill>
+          </w14:textFill>
+        </w:rPr>
+        <w:t>demander un Tenant de test gratuit</w:t>
+      </w:r>
+      <w:r>
+        <w:rPr>
+          <w:color w:val="000000" w:themeColor="text1"/>
+          <w14:textOutline w14:w="0" w14:cap="flat" w14:cmpd="sng" w14:algn="ctr">
+            <w14:noFill/>
+            <w14:prstDash w14:val="solid"/>
+            <w14:round/>
+          </w14:textOutline>
+          <w14:textFill>
+            <w14:gradFill>
+              <w14:gsLst>
+                <w14:gs w14:pos="21000">
+                  <w14:srgbClr w14:val="53575C"/>
+                </w14:gs>
+                <w14:gs w14:pos="88000">
+                  <w14:srgbClr w14:val="C5C7CA"/>
+                </w14:gs>
+              </w14:gsLst>
+              <w14:lin w14:ang="5400000" w14:scaled="0"/>
+            </w14:gradFill>
+          </w14:textFill>
+        </w:rPr>
+        <w:t>.</w:t>
+      </w:r>
+    </w:p>
+    <w:p>
+      <w:pPr>
+        <w:numPr>
+          <w:ilvl w:val="0"/>
+          <w:numId w:val="10"/>
+        </w:numPr>
+        <w:rPr>
+          <w:color w:val="000000" w:themeColor="text1"/>
+          <w14:textOutline w14:w="0" w14:cap="flat" w14:cmpd="sng" w14:algn="ctr">
+            <w14:noFill/>
+            <w14:prstDash w14:val="solid"/>
+            <w14:round/>
+          </w14:textOutline>
+          <w14:textFill>
+            <w14:gradFill>
+              <w14:gsLst>
+                <w14:gs w14:pos="21000">
+                  <w14:srgbClr w14:val="53575C"/>
+                </w14:gs>
+                <w14:gs w14:pos="88000">
+                  <w14:srgbClr w14:val="C5C7CA"/>
+                </w14:gs>
+              </w14:gsLst>
+              <w14:lin w14:ang="5400000" w14:scaled="0"/>
+            </w14:gradFill>
+          </w14:textFill>
+        </w:rPr>
+      </w:pPr>
+      <w:r>
+        <w:rPr>
+          <w:color w:val="000000" w:themeColor="text1"/>
+          <w14:textOutline w14:w="0" w14:cap="flat" w14:cmpd="sng" w14:algn="ctr">
+            <w14:noFill/>
+            <w14:prstDash w14:val="solid"/>
+            <w14:round/>
+          </w14:textOutline>
+          <w14:textFill>
+            <w14:gradFill>
+              <w14:gsLst>
+                <w14:gs w14:pos="21000">
+                  <w14:srgbClr w14:val="53575C"/>
+                </w14:gs>
+                <w14:gs w14:pos="88000">
+                  <w14:srgbClr w14:val="C5C7CA"/>
+                </w14:gs>
+              </w14:gsLst>
+              <w14:lin w14:ang="5400000" w14:scaled="0"/>
+            </w14:gradFill>
+          </w14:textFill>
+        </w:rPr>
+        <w:t xml:space="preserve">Dans le tableau de bord du </w:t>
+      </w:r>
+      <w:r>
+        <w:rPr>
+          <w:b/>
+          <w:bCs/>
+          <w:color w:val="000000" w:themeColor="text1"/>
+          <w14:textOutline w14:w="0" w14:cap="flat" w14:cmpd="sng" w14:algn="ctr">
+            <w14:noFill/>
+            <w14:prstDash w14:val="solid"/>
+            <w14:round/>
+          </w14:textOutline>
+          <w14:textFill>
+            <w14:gradFill>
+              <w14:gsLst>
+                <w14:gs w14:pos="21000">
+                  <w14:srgbClr w14:val="53575C"/>
+                </w14:gs>
+                <w14:gs w14:pos="88000">
+                  <w14:srgbClr w14:val="C5C7CA"/>
+                </w14:gs>
+              </w14:gsLst>
+              <w14:lin w14:ang="5400000" w14:scaled="0"/>
+            </w14:gradFill>
+          </w14:textFill>
+        </w:rPr>
+        <w:t xml:space="preserve">Microsoft 365 </w:t>
+      </w:r>
+      <w:proofErr w:type="spellStart"/>
+      <w:r>
+        <w:rPr>
+          <w:b/>
+          <w:bCs/>
+          <w:color w:val="000000" w:themeColor="text1"/>
+          <w14:textOutline w14:w="0" w14:cap="flat" w14:cmpd="sng" w14:algn="ctr">
+            <w14:noFill/>
+            <w14:prstDash w14:val="solid"/>
+            <w14:round/>
+          </w14:textOutline>
+          <w14:textFill>
+            <w14:gradFill>
+              <w14:gsLst>
+                <w14:gs w14:pos="21000">
+                  <w14:srgbClr w14:val="53575C"/>
+                </w14:gs>
+                <w14:gs w14:pos="88000">
+                  <w14:srgbClr w14:val="C5C7CA"/>
+                </w14:gs>
+              </w14:gsLst>
+              <w14:lin w14:ang="5400000" w14:scaled="0"/>
+            </w14:gradFill>
+          </w14:textFill>
+        </w:rPr>
+        <w:t>Developer</w:t>
+      </w:r>
+      <w:proofErr w:type="spellEnd"/>
+      <w:r>
+        <w:rPr>
+          <w:b/>
+          <w:bCs/>
+          <w:color w:val="000000" w:themeColor="text1"/>
+          <w14:textOutline w14:w="0" w14:cap="flat" w14:cmpd="sng" w14:algn="ctr">
+            <w14:noFill/>
+            <w14:prstDash w14:val="solid"/>
+            <w14:round/>
+          </w14:textOutline>
+          <w14:textFill>
+            <w14:gradFill>
+              <w14:gsLst>
+                <w14:gs w14:pos="21000">
+                  <w14:srgbClr w14:val="53575C"/>
+                </w14:gs>
+                <w14:gs w14:pos="88000">
+                  <w14:srgbClr w14:val="C5C7CA"/>
+                </w14:gs>
+              </w14:gsLst>
+              <w14:lin w14:ang="5400000" w14:scaled="0"/>
+            </w14:gradFill>
+          </w14:textFill>
+        </w:rPr>
+        <w:t xml:space="preserve"> Program</w:t>
+      </w:r>
+      <w:r>
+        <w:rPr>
+          <w:color w:val="000000" w:themeColor="text1"/>
+          <w14:textOutline w14:w="0" w14:cap="flat" w14:cmpd="sng" w14:algn="ctr">
+            <w14:noFill/>
+            <w14:prstDash w14:val="solid"/>
+            <w14:round/>
+          </w14:textOutline>
+          <w14:textFill>
+            <w14:gradFill>
+              <w14:gsLst>
+                <w14:gs w14:pos="21000">
+                  <w14:srgbClr w14:val="53575C"/>
+                </w14:gs>
+                <w14:gs w14:pos="88000">
+                  <w14:srgbClr w14:val="C5C7CA"/>
+                </w14:gs>
+              </w14:gsLst>
+              <w14:lin w14:ang="5400000" w14:scaled="0"/>
+            </w14:gradFill>
+          </w14:textFill>
+        </w:rPr>
+        <w:t xml:space="preserve">, clique sur </w:t>
+      </w:r>
+      <w:r>
+        <w:rPr>
+          <w:b/>
+          <w:bCs/>
+          <w:color w:val="000000" w:themeColor="text1"/>
+          <w14:textOutline w14:w="0" w14:cap="flat" w14:cmpd="sng" w14:algn="ctr">
+            <w14:noFill/>
+            <w14:prstDash w14:val="solid"/>
+            <w14:round/>
+          </w14:textOutline>
+          <w14:textFill>
+            <w14:gradFill>
+              <w14:gsLst>
+                <w14:gs w14:pos="21000">
+                  <w14:srgbClr w14:val="53575C"/>
+                </w14:gs>
+                <w14:gs w14:pos="88000">
+                  <w14:srgbClr w14:val="C5C7CA"/>
+                </w14:gs>
+              </w14:gsLst>
+              <w14:lin w14:ang="5400000" w14:scaled="0"/>
+            </w14:gradFill>
+          </w14:textFill>
+        </w:rPr>
+        <w:t xml:space="preserve">"Set up E5 </w:t>
+      </w:r>
+      <w:proofErr w:type="spellStart"/>
+      <w:r>
+        <w:rPr>
+          <w:b/>
+          <w:bCs/>
+          <w:color w:val="000000" w:themeColor="text1"/>
+          <w14:textOutline w14:w="0" w14:cap="flat" w14:cmpd="sng" w14:algn="ctr">
+            <w14:noFill/>
+            <w14:prstDash w14:val="solid"/>
+            <w14:round/>
+          </w14:textOutline>
+          <w14:textFill>
+            <w14:gradFill>
+              <w14:gsLst>
+                <w14:gs w14:pos="21000">
+                  <w14:srgbClr w14:val="53575C"/>
+                </w14:gs>
+                <w14:gs w14:pos="88000">
+                  <w14:srgbClr w14:val="C5C7CA"/>
+                </w14:gs>
+              </w14:gsLst>
+              <w14:lin w14:ang="5400000" w14:scaled="0"/>
+            </w14:gradFill>
+          </w14:textFill>
+        </w:rPr>
+        <w:t>subscription</w:t>
+      </w:r>
+      <w:proofErr w:type="spellEnd"/>
+      <w:r>
+        <w:rPr>
+          <w:b/>
+          <w:bCs/>
+          <w:color w:val="000000" w:themeColor="text1"/>
+          <w14:textOutline w14:w="0" w14:cap="flat" w14:cmpd="sng" w14:algn="ctr">
+            <w14:noFill/>
+            <w14:prstDash w14:val="solid"/>
+            <w14:round/>
+          </w14:textOutline>
+          <w14:textFill>
+            <w14:gradFill>
+              <w14:gsLst>
+                <w14:gs w14:pos="21000">
+                  <w14:srgbClr w14:val="53575C"/>
+                </w14:gs>
+                <w14:gs w14:pos="88000">
+                  <w14:srgbClr w14:val="C5C7CA"/>
+                </w14:gs>
+              </w14:gsLst>
+              <w14:lin w14:ang="5400000" w14:scaled="0"/>
+            </w14:gradFill>
+          </w14:textFill>
+        </w:rPr>
+        <w:t>"</w:t>
+      </w:r>
+    </w:p>
+    <w:p>
+      <w:pPr>
+        <w:numPr>
+          <w:ilvl w:val="0"/>
+          <w:numId w:val="10"/>
+        </w:numPr>
+        <w:rPr>
+          <w:color w:val="000000" w:themeColor="text1"/>
+          <w14:textOutline w14:w="0" w14:cap="flat" w14:cmpd="sng" w14:algn="ctr">
+            <w14:noFill/>
+            <w14:prstDash w14:val="solid"/>
+            <w14:round/>
+          </w14:textOutline>
+          <w14:textFill>
+            <w14:gradFill>
+              <w14:gsLst>
+                <w14:gs w14:pos="21000">
+                  <w14:srgbClr w14:val="53575C"/>
+                </w14:gs>
+                <w14:gs w14:pos="88000">
+                  <w14:srgbClr w14:val="C5C7CA"/>
+                </w14:gs>
+              </w14:gsLst>
+              <w14:lin w14:ang="5400000" w14:scaled="0"/>
+            </w14:gradFill>
+          </w14:textFill>
+        </w:rPr>
+      </w:pPr>
+      <w:r>
+        <w:rPr>
+          <w:color w:val="000000" w:themeColor="text1"/>
+          <w14:textOutline w14:w="0" w14:cap="flat" w14:cmpd="sng" w14:algn="ctr">
+            <w14:noFill/>
+            <w14:prstDash w14:val="solid"/>
+            <w14:round/>
+          </w14:textOutline>
+          <w14:textFill>
+            <w14:gradFill>
+              <w14:gsLst>
+                <w14:gs w14:pos="21000">
+                  <w14:srgbClr w14:val="53575C"/>
+                </w14:gs>
+                <w14:gs w14:pos="88000">
+                  <w14:srgbClr w14:val="C5C7CA"/>
+                </w14:gs>
+              </w14:gsLst>
+              <w14:lin w14:ang="5400000" w14:scaled="0"/>
+            </w14:gradFill>
+          </w14:textFill>
+        </w:rPr>
+        <w:t>Choisis un nom pour ton tenant (ex. monprojet.onmicrosoft.com)</w:t>
+      </w:r>
+    </w:p>
+    <w:p>
+      <w:pPr>
+        <w:numPr>
+          <w:ilvl w:val="0"/>
+          <w:numId w:val="10"/>
+        </w:numPr>
+        <w:rPr>
+          <w:color w:val="000000" w:themeColor="text1"/>
+          <w14:textOutline w14:w="0" w14:cap="flat" w14:cmpd="sng" w14:algn="ctr">
+            <w14:noFill/>
+            <w14:prstDash w14:val="solid"/>
+            <w14:round/>
+          </w14:textOutline>
+          <w14:textFill>
+            <w14:gradFill>
+              <w14:gsLst>
+                <w14:gs w14:pos="21000">
+                  <w14:srgbClr w14:val="53575C"/>
+                </w14:gs>
+                <w14:gs w14:pos="88000">
+                  <w14:srgbClr w14:val="C5C7CA"/>
+                </w14:gs>
+              </w14:gsLst>
+              <w14:lin w14:ang="5400000" w14:scaled="0"/>
+            </w14:gradFill>
+          </w14:textFill>
+        </w:rPr>
+      </w:pPr>
+      <w:r>
+        <w:rPr>
+          <w:color w:val="000000" w:themeColor="text1"/>
+          <w14:textOutline w14:w="0" w14:cap="flat" w14:cmpd="sng" w14:algn="ctr">
+            <w14:noFill/>
+            <w14:prstDash w14:val="solid"/>
+            <w14:round/>
+          </w14:textOutline>
+          <w14:textFill>
+            <w14:gradFill>
+              <w14:gsLst>
+                <w14:gs w14:pos="21000">
+                  <w14:srgbClr w14:val="53575C"/>
+                </w14:gs>
+                <w14:gs w14:pos="88000">
+                  <w14:srgbClr w14:val="C5C7CA"/>
+                </w14:gs>
+              </w14:gsLst>
+              <w14:lin w14:ang="5400000" w14:scaled="0"/>
+            </w14:gradFill>
+          </w14:textFill>
+        </w:rPr>
+        <w:t xml:space="preserve">Définis un </w:t>
+      </w:r>
+      <w:r>
+        <w:rPr>
+          <w:b/>
+          <w:bCs/>
+          <w:color w:val="000000" w:themeColor="text1"/>
+          <w14:textOutline w14:w="0" w14:cap="flat" w14:cmpd="sng" w14:algn="ctr">
+            <w14:noFill/>
+            <w14:prstDash w14:val="solid"/>
+            <w14:round/>
+          </w14:textOutline>
+          <w14:textFill>
+            <w14:gradFill>
+              <w14:gsLst>
+                <w14:gs w14:pos="21000">
+                  <w14:srgbClr w14:val="53575C"/>
+                </w14:gs>
+                <w14:gs w14:pos="88000">
+                  <w14:srgbClr w14:val="C5C7CA"/>
+                </w14:gs>
+              </w14:gsLst>
+              <w14:lin w14:ang="5400000" w14:scaled="0"/>
+            </w14:gradFill>
+          </w14:textFill>
+        </w:rPr>
+        <w:t>administrateur global</w:t>
+      </w:r>
+      <w:r>
+        <w:rPr>
+          <w:color w:val="000000" w:themeColor="text1"/>
+          <w14:textOutline w14:w="0" w14:cap="flat" w14:cmpd="sng" w14:algn="ctr">
+            <w14:noFill/>
+            <w14:prstDash w14:val="solid"/>
+            <w14:round/>
+          </w14:textOutline>
+          <w14:textFill>
+            <w14:gradFill>
+              <w14:gsLst>
+                <w14:gs w14:pos="21000">
+                  <w14:srgbClr w14:val="53575C"/>
+                </w14:gs>
+                <w14:gs w14:pos="88000">
+                  <w14:srgbClr w14:val="C5C7CA"/>
+                </w14:gs>
+              </w14:gsLst>
+              <w14:lin w14:ang="5400000" w14:scaled="0"/>
+            </w14:gradFill>
+          </w14:textFill>
+        </w:rPr>
+        <w:t xml:space="preserve"> et un mot de passe</w:t>
+      </w:r>
+    </w:p>
+    <w:p>
+      <w:pPr>
+        <w:numPr>
+          <w:ilvl w:val="0"/>
+          <w:numId w:val="10"/>
+        </w:numPr>
+        <w:rPr>
+          <w:color w:val="000000" w:themeColor="text1"/>
+          <w14:textOutline w14:w="0" w14:cap="flat" w14:cmpd="sng" w14:algn="ctr">
+            <w14:noFill/>
+            <w14:prstDash w14:val="solid"/>
+            <w14:round/>
+          </w14:textOutline>
+          <w14:textFill>
+            <w14:gradFill>
+              <w14:gsLst>
+                <w14:gs w14:pos="21000">
+                  <w14:srgbClr w14:val="53575C"/>
+                </w14:gs>
+                <w14:gs w14:pos="88000">
+                  <w14:srgbClr w14:val="C5C7CA"/>
+                </w14:gs>
+              </w14:gsLst>
+              <w14:lin w14:ang="5400000" w14:scaled="0"/>
+            </w14:gradFill>
+          </w14:textFill>
+        </w:rPr>
+      </w:pPr>
+      <w:r>
+        <w:rPr>
+          <w:color w:val="000000" w:themeColor="text1"/>
+          <w14:textOutline w14:w="0" w14:cap="flat" w14:cmpd="sng" w14:algn="ctr">
+            <w14:noFill/>
+            <w14:prstDash w14:val="solid"/>
+            <w14:round/>
+          </w14:textOutline>
+          <w14:textFill>
+            <w14:gradFill>
+              <w14:gsLst>
+                <w14:gs w14:pos="21000">
+                  <w14:srgbClr w14:val="53575C"/>
+                </w14:gs>
+                <w14:gs w14:pos="88000">
+                  <w14:srgbClr w14:val="C5C7CA"/>
+                </w14:gs>
+              </w14:gsLst>
+              <w14:lin w14:ang="5400000" w14:scaled="0"/>
+            </w14:gradFill>
+          </w14:textFill>
+        </w:rPr>
+        <w:t>Note bien ces identifiants, car ils seront nécessaires pour te connecter à ton SharePoint</w:t>
+      </w:r>
+    </w:p>
+    <w:p>
+      <w:pPr>
+        <w:rPr>
+          <w:color w:val="000000" w:themeColor="text1"/>
+          <w14:textOutline w14:w="0" w14:cap="flat" w14:cmpd="sng" w14:algn="ctr">
+            <w14:noFill/>
+            <w14:prstDash w14:val="solid"/>
+            <w14:round/>
+          </w14:textOutline>
+          <w14:textFill>
+            <w14:gradFill>
+              <w14:gsLst>
+                <w14:gs w14:pos="21000">
+                  <w14:srgbClr w14:val="53575C"/>
+                </w14:gs>
+                <w14:gs w14:pos="88000">
+                  <w14:srgbClr w14:val="C5C7CA"/>
+                </w14:gs>
+              </w14:gsLst>
+              <w14:lin w14:ang="5400000" w14:scaled="0"/>
+            </w14:gradFill>
+          </w14:textFill>
+        </w:rPr>
+      </w:pPr>
+      <w:r>
+        <w:rPr>
+          <w:rFonts w:ascii="Segoe UI Emoji" w:hAnsi="Segoe UI Emoji" w:cs="Segoe UI Emoji"/>
+          <w:color w:val="000000" w:themeColor="text1"/>
+          <w14:textOutline w14:w="0" w14:cap="flat" w14:cmpd="sng" w14:algn="ctr">
+            <w14:noFill/>
+            <w14:prstDash w14:val="solid"/>
+            <w14:round/>
+          </w14:textOutline>
+          <w14:textFill>
+            <w14:gradFill>
+              <w14:gsLst>
+                <w14:gs w14:pos="21000">
+                  <w14:srgbClr w14:val="53575C"/>
+                </w14:gs>
+                <w14:gs w14:pos="88000">
+                  <w14:srgbClr w14:val="C5C7CA"/>
+                </w14:gs>
+              </w14:gsLst>
+              <w14:lin w14:ang="5400000" w14:scaled="0"/>
+            </w14:gradFill>
+          </w14:textFill>
+        </w:rPr>
+        <w:t>⏳</w:t>
+      </w:r>
+      <w:r>
+        <w:rPr>
+          <w:color w:val="000000" w:themeColor="text1"/>
+          <w14:textOutline w14:w="0" w14:cap="flat" w14:cmpd="sng" w14:algn="ctr">
+            <w14:noFill/>
+            <w14:prstDash w14:val="solid"/>
+            <w14:round/>
+          </w14:textOutline>
+          <w14:textFill>
+            <w14:gradFill>
+              <w14:gsLst>
+                <w14:gs w14:pos="21000">
+                  <w14:srgbClr w14:val="53575C"/>
+                </w14:gs>
+                <w14:gs w14:pos="88000">
+                  <w14:srgbClr w14:val="C5C7CA"/>
+                </w14:gs>
+              </w14:gsLst>
+              <w14:lin w14:ang="5400000" w14:scaled="0"/>
+            </w14:gradFill>
+          </w14:textFill>
+        </w:rPr>
+        <w:t xml:space="preserve"> </w:t>
+      </w:r>
+      <w:r>
+        <w:rPr>
+          <w:b/>
+          <w:bCs/>
+          <w:color w:val="000000" w:themeColor="text1"/>
+          <w14:textOutline w14:w="0" w14:cap="flat" w14:cmpd="sng" w14:algn="ctr">
+            <w14:noFill/>
+            <w14:prstDash w14:val="solid"/>
+            <w14:round/>
+          </w14:textOutline>
+          <w14:textFill>
+            <w14:gradFill>
+              <w14:gsLst>
+                <w14:gs w14:pos="21000">
+                  <w14:srgbClr w14:val="53575C"/>
+                </w14:gs>
+                <w14:gs w14:pos="88000">
+                  <w14:srgbClr w14:val="C5C7CA"/>
+                </w14:gs>
+              </w14:gsLst>
+              <w14:lin w14:ang="5400000" w14:scaled="0"/>
+            </w14:gradFill>
+          </w14:textFill>
+        </w:rPr>
+        <w:t>Ton tenant sera prêt en quelques minutes</w:t>
+      </w:r>
+      <w:r>
+        <w:rPr>
+          <w:color w:val="000000" w:themeColor="text1"/>
+          <w14:textOutline w14:w="0" w14:cap="flat" w14:cmpd="sng" w14:algn="ctr">
+            <w14:noFill/>
+            <w14:prstDash w14:val="solid"/>
+            <w14:round/>
+          </w14:textOutline>
+          <w14:textFill>
+            <w14:gradFill>
+              <w14:gsLst>
+                <w14:gs w14:pos="21000">
+                  <w14:srgbClr w14:val="53575C"/>
+                </w14:gs>
+                <w14:gs w14:pos="88000">
+                  <w14:srgbClr w14:val="C5C7CA"/>
+                </w14:gs>
+              </w14:gsLst>
+              <w14:lin w14:ang="5400000" w14:scaled="0"/>
+            </w14:gradFill>
+          </w14:textFill>
+        </w:rPr>
+        <w:t xml:space="preserve"> et inclura </w:t>
+      </w:r>
+      <w:r>
+        <w:rPr>
+          <w:b/>
+          <w:bCs/>
+          <w:color w:val="000000" w:themeColor="text1"/>
+          <w14:textOutline w14:w="0" w14:cap="flat" w14:cmpd="sng" w14:algn="ctr">
+            <w14:noFill/>
+            <w14:prstDash w14:val="solid"/>
+            <w14:round/>
+          </w14:textOutline>
+          <w14:textFill>
+            <w14:gradFill>
+              <w14:gsLst>
+                <w14:gs w14:pos="21000">
+                  <w14:srgbClr w14:val="53575C"/>
+                </w14:gs>
+                <w14:gs w14:pos="88000">
+                  <w14:srgbClr w14:val="C5C7CA"/>
+                </w14:gs>
+              </w14:gsLst>
+              <w14:lin w14:ang="5400000" w14:scaled="0"/>
+            </w14:gradFill>
+          </w14:textFill>
+        </w:rPr>
+        <w:t>SharePoint Online</w:t>
+      </w:r>
+      <w:r>
+        <w:rPr>
+          <w:color w:val="000000" w:themeColor="text1"/>
+          <w14:textOutline w14:w="0" w14:cap="flat" w14:cmpd="sng" w14:algn="ctr">
+            <w14:noFill/>
+            <w14:prstDash w14:val="solid"/>
+            <w14:round/>
+          </w14:textOutline>
+          <w14:textFill>
+            <w14:gradFill>
+              <w14:gsLst>
+                <w14:gs w14:pos="21000">
+                  <w14:srgbClr w14:val="53575C"/>
+                </w14:gs>
+                <w14:gs w14:pos="88000">
+                  <w14:srgbClr w14:val="C5C7CA"/>
+                </w14:gs>
+              </w14:gsLst>
+              <w14:lin w14:ang="5400000" w14:scaled="0"/>
+            </w14:gradFill>
+          </w14:textFill>
+        </w:rPr>
+        <w:t xml:space="preserve">, </w:t>
+      </w:r>
+      <w:r>
+        <w:rPr>
+          <w:b/>
+          <w:bCs/>
+          <w:color w:val="000000" w:themeColor="text1"/>
+          <w14:textOutline w14:w="0" w14:cap="flat" w14:cmpd="sng" w14:algn="ctr">
+            <w14:noFill/>
+            <w14:prstDash w14:val="solid"/>
+            <w14:round/>
+          </w14:textOutline>
+          <w14:textFill>
+            <w14:gradFill>
+              <w14:gsLst>
+                <w14:gs w14:pos="21000">
+                  <w14:srgbClr w14:val="53575C"/>
+                </w14:gs>
+                <w14:gs w14:pos="88000">
+                  <w14:srgbClr w14:val="C5C7CA"/>
+                </w14:gs>
+              </w14:gsLst>
+              <w14:lin w14:ang="5400000" w14:scaled="0"/>
+            </w14:gradFill>
+          </w14:textFill>
+        </w:rPr>
+        <w:t>Teams</w:t>
+      </w:r>
+      <w:r>
+        <w:rPr>
+          <w:color w:val="000000" w:themeColor="text1"/>
+          <w14:textOutline w14:w="0" w14:cap="flat" w14:cmpd="sng" w14:algn="ctr">
+            <w14:noFill/>
+            <w14:prstDash w14:val="solid"/>
+            <w14:round/>
+          </w14:textOutline>
+          <w14:textFill>
+            <w14:gradFill>
+              <w14:gsLst>
+                <w14:gs w14:pos="21000">
+                  <w14:srgbClr w14:val="53575C"/>
+                </w14:gs>
+                <w14:gs w14:pos="88000">
+                  <w14:srgbClr w14:val="C5C7CA"/>
+                </w14:gs>
+              </w14:gsLst>
+              <w14:lin w14:ang="5400000" w14:scaled="0"/>
+            </w14:gradFill>
+          </w14:textFill>
+        </w:rPr>
+        <w:t xml:space="preserve">, </w:t>
+      </w:r>
+      <w:r>
+        <w:rPr>
+          <w:b/>
+          <w:bCs/>
+          <w:color w:val="000000" w:themeColor="text1"/>
+          <w14:textOutline w14:w="0" w14:cap="flat" w14:cmpd="sng" w14:algn="ctr">
+            <w14:noFill/>
+            <w14:prstDash w14:val="solid"/>
+            <w14:round/>
+          </w14:textOutline>
+          <w14:textFill>
+            <w14:gradFill>
+              <w14:gsLst>
+                <w14:gs w14:pos="21000">
+                  <w14:srgbClr w14:val="53575C"/>
+                </w14:gs>
+                <w14:gs w14:pos="88000">
+                  <w14:srgbClr w14:val="C5C7CA"/>
+                </w14:gs>
+              </w14:gsLst>
+              <w14:lin w14:ang="5400000" w14:scaled="0"/>
+            </w14:gradFill>
+          </w14:textFill>
+        </w:rPr>
+        <w:t>OneDrive</w:t>
+      </w:r>
+      <w:r>
+        <w:rPr>
+          <w:color w:val="000000" w:themeColor="text1"/>
+          <w14:textOutline w14:w="0" w14:cap="flat" w14:cmpd="sng" w14:algn="ctr">
+            <w14:noFill/>
+            <w14:prstDash w14:val="solid"/>
+            <w14:round/>
+          </w14:textOutline>
+          <w14:textFill>
+            <w14:gradFill>
+              <w14:gsLst>
+                <w14:gs w14:pos="21000">
+                  <w14:srgbClr w14:val="53575C"/>
+                </w14:gs>
+                <w14:gs w14:pos="88000">
+                  <w14:srgbClr w14:val="C5C7CA"/>
+                </w14:gs>
+              </w14:gsLst>
+              <w14:lin w14:ang="5400000" w14:scaled="0"/>
+            </w14:gradFill>
+          </w14:textFill>
+        </w:rPr>
+        <w:t>, etc.</w:t>
+      </w:r>
+    </w:p>
+    <w:p>
+      <w:pPr>
+        <w:rPr>
+          <w:b/>
+          <w:bCs/>
+          <w:color w:val="000000" w:themeColor="text1"/>
+          <w14:textOutline w14:w="0" w14:cap="flat" w14:cmpd="sng" w14:algn="ctr">
+            <w14:noFill/>
+            <w14:prstDash w14:val="solid"/>
+            <w14:round/>
+          </w14:textOutline>
+          <w14:textFill>
+            <w14:gradFill>
+              <w14:gsLst>
+                <w14:gs w14:pos="21000">
+                  <w14:srgbClr w14:val="53575C"/>
+                </w14:gs>
+                <w14:gs w14:pos="88000">
+                  <w14:srgbClr w14:val="C5C7CA"/>
+                </w14:gs>
+              </w14:gsLst>
+              <w14:lin w14:ang="5400000" w14:scaled="0"/>
+            </w14:gradFill>
+          </w14:textFill>
+        </w:rPr>
+      </w:pPr>
+      <w:r>
+        <w:rPr>
+          <w:b/>
+          <w:bCs/>
+          <w:color w:val="000000" w:themeColor="text1"/>
+          <w14:textOutline w14:w="0" w14:cap="flat" w14:cmpd="sng" w14:algn="ctr">
+            <w14:noFill/>
+            <w14:prstDash w14:val="solid"/>
+            <w14:round/>
+          </w14:textOutline>
+          <w14:textFill>
+            <w14:gradFill>
+              <w14:gsLst>
+                <w14:gs w14:pos="21000">
+                  <w14:srgbClr w14:val="53575C"/>
+                </w14:gs>
+                <w14:gs w14:pos="88000">
+                  <w14:srgbClr w14:val="C5C7CA"/>
+                </w14:gs>
+              </w14:gsLst>
+              <w14:lin w14:ang="5400000" w14:scaled="0"/>
+            </w14:gradFill>
+          </w14:textFill>
+        </w:rPr>
+        <w:t>3️</w:t>
+      </w:r>
+      <w:r>
+        <w:rPr>
+          <w:rFonts w:ascii="Segoe UI Symbol" w:hAnsi="Segoe UI Symbol" w:cs="Segoe UI Symbol"/>
+          <w:b/>
+          <w:bCs/>
+          <w:color w:val="000000" w:themeColor="text1"/>
+          <w14:textOutline w14:w="0" w14:cap="flat" w14:cmpd="sng" w14:algn="ctr">
+            <w14:noFill/>
+            <w14:prstDash w14:val="solid"/>
+            <w14:round/>
+          </w14:textOutline>
+          <w14:textFill>
+            <w14:gradFill>
+              <w14:gsLst>
+                <w14:gs w14:pos="21000">
+                  <w14:srgbClr w14:val="53575C"/>
+                </w14:gs>
+                <w14:gs w14:pos="88000">
+                  <w14:srgbClr w14:val="C5C7CA"/>
+                </w14:gs>
+              </w14:gsLst>
+              <w14:lin w14:ang="5400000" w14:scaled="0"/>
+            </w14:gradFill>
+          </w14:textFill>
+        </w:rPr>
+        <w:t>⃣</w:t>
+      </w:r>
+      <w:r>
+        <w:rPr>
+          <w:b/>
+          <w:bCs/>
+          <w:color w:val="000000" w:themeColor="text1"/>
+          <w14:textOutline w14:w="0" w14:cap="flat" w14:cmpd="sng" w14:algn="ctr">
+            <w14:noFill/>
+            <w14:prstDash w14:val="solid"/>
+            <w14:round/>
+          </w14:textOutline>
+          <w14:textFill>
+            <w14:gradFill>
+              <w14:gsLst>
+                <w14:gs w14:pos="21000">
+                  <w14:srgbClr w14:val="53575C"/>
+                </w14:gs>
+                <w14:gs w14:pos="88000">
+                  <w14:srgbClr w14:val="C5C7CA"/>
+                </w14:gs>
+              </w14:gsLst>
+              <w14:lin w14:ang="5400000" w14:scaled="0"/>
+            </w14:gradFill>
+          </w14:textFill>
+        </w:rPr>
+        <w:t xml:space="preserve"> Accéder à SharePoint Online</w:t>
+      </w:r>
+    </w:p>
+    <w:p>
+      <w:pPr>
+        <w:rPr>
+          <w:color w:val="000000" w:themeColor="text1"/>
+          <w14:textOutline w14:w="0" w14:cap="flat" w14:cmpd="sng" w14:algn="ctr">
+            <w14:noFill/>
+            <w14:prstDash w14:val="solid"/>
+            <w14:round/>
+          </w14:textOutline>
+          <w14:textFill>
+            <w14:gradFill>
+              <w14:gsLst>
+                <w14:gs w14:pos="21000">
+                  <w14:srgbClr w14:val="53575C"/>
+                </w14:gs>
+                <w14:gs w14:pos="88000">
+                  <w14:srgbClr w14:val="C5C7CA"/>
+                </w14:gs>
+              </w14:gsLst>
+              <w14:lin w14:ang="5400000" w14:scaled="0"/>
+            </w14:gradFill>
+          </w14:textFill>
+        </w:rPr>
+      </w:pPr>
+      <w:r>
+        <w:rPr>
+          <w:color w:val="000000" w:themeColor="text1"/>
+          <w14:textOutline w14:w="0" w14:cap="flat" w14:cmpd="sng" w14:algn="ctr">
+            <w14:noFill/>
+            <w14:prstDash w14:val="solid"/>
+            <w14:round/>
+          </w14:textOutline>
+          <w14:textFill>
+            <w14:gradFill>
+              <w14:gsLst>
+                <w14:gs w14:pos="21000">
+                  <w14:srgbClr w14:val="53575C"/>
+                </w14:gs>
+                <w14:gs w14:pos="88000">
+                  <w14:srgbClr w14:val="C5C7CA"/>
+                </w14:gs>
+              </w14:gsLst>
+              <w14:lin w14:ang="5400000" w14:scaled="0"/>
+            </w14:gradFill>
+          </w14:textFill>
+        </w:rPr>
+        <w:t xml:space="preserve">Une fois ton Tenant prêt, tu pourras accéder à </w:t>
+      </w:r>
+      <w:r>
+        <w:rPr>
+          <w:b/>
+          <w:bCs/>
+          <w:color w:val="000000" w:themeColor="text1"/>
+          <w14:textOutline w14:w="0" w14:cap="flat" w14:cmpd="sng" w14:algn="ctr">
+            <w14:noFill/>
+            <w14:prstDash w14:val="solid"/>
+            <w14:round/>
+          </w14:textOutline>
+          <w14:textFill>
+            <w14:gradFill>
+              <w14:gsLst>
+                <w14:gs w14:pos="21000">
+                  <w14:srgbClr w14:val="53575C"/>
+                </w14:gs>
+                <w14:gs w14:pos="88000">
+                  <w14:srgbClr w14:val="C5C7CA"/>
+                </w14:gs>
+              </w14:gsLst>
+              <w14:lin w14:ang="5400000" w14:scaled="0"/>
+            </w14:gradFill>
+          </w14:textFill>
+        </w:rPr>
+        <w:t>SharePoint Online</w:t>
+      </w:r>
+      <w:r>
+        <w:rPr>
+          <w:color w:val="000000" w:themeColor="text1"/>
+          <w14:textOutline w14:w="0" w14:cap="flat" w14:cmpd="sng" w14:algn="ctr">
+            <w14:noFill/>
+            <w14:prstDash w14:val="solid"/>
+            <w14:round/>
+          </w14:textOutline>
+          <w14:textFill>
+            <w14:gradFill>
+              <w14:gsLst>
+                <w14:gs w14:pos="21000">
+                  <w14:srgbClr w14:val="53575C"/>
+                </w14:gs>
+                <w14:gs w14:pos="88000">
+                  <w14:srgbClr w14:val="C5C7CA"/>
+                </w14:gs>
+              </w14:gsLst>
+              <w14:lin w14:ang="5400000" w14:scaled="0"/>
+            </w14:gradFill>
+          </w14:textFill>
+        </w:rPr>
+        <w:t xml:space="preserve"> :</w:t>
+      </w:r>
+      <w:r>
+        <w:rPr>
+          <w:color w:val="000000" w:themeColor="text1"/>
+          <w14:textOutline w14:w="0" w14:cap="flat" w14:cmpd="sng" w14:algn="ctr">
+            <w14:noFill/>
+            <w14:prstDash w14:val="solid"/>
+            <w14:round/>
+          </w14:textOutline>
+          <w14:textFill>
+            <w14:gradFill>
+              <w14:gsLst>
+                <w14:gs w14:pos="21000">
+                  <w14:srgbClr w14:val="53575C"/>
+                </w14:gs>
+                <w14:gs w14:pos="88000">
+                  <w14:srgbClr w14:val="C5C7CA"/>
+                </w14:gs>
+              </w14:gsLst>
+              <w14:lin w14:ang="5400000" w14:scaled="0"/>
+            </w14:gradFill>
+          </w14:textFill>
+        </w:rPr>
+        <w:br/>
+      </w:r>
+      <w:r>
+        <w:rPr>
+          <w:rFonts w:ascii="Segoe UI Emoji" w:hAnsi="Segoe UI Emoji" w:cs="Segoe UI Emoji"/>
+          <w:color w:val="000000" w:themeColor="text1"/>
+          <w14:textOutline w14:w="0" w14:cap="flat" w14:cmpd="sng" w14:algn="ctr">
+            <w14:noFill/>
+            <w14:prstDash w14:val="solid"/>
+            <w14:round/>
+          </w14:textOutline>
+          <w14:textFill>
+            <w14:gradFill>
+              <w14:gsLst>
+                <w14:gs w14:pos="21000">
+                  <w14:srgbClr w14:val="53575C"/>
+                </w14:gs>
+                <w14:gs w14:pos="88000">
+                  <w14:srgbClr w14:val="C5C7CA"/>
+                </w14:gs>
+              </w14:gsLst>
+              <w14:lin w14:ang="5400000" w14:scaled="0"/>
+            </w14:gradFill>
+          </w14:textFill>
+        </w:rPr>
+        <w:t>📌</w:t>
+      </w:r>
+      <w:r>
+        <w:rPr>
+          <w:color w:val="000000" w:themeColor="text1"/>
+          <w14:textOutline w14:w="0" w14:cap="flat" w14:cmpd="sng" w14:algn="ctr">
+            <w14:noFill/>
+            <w14:prstDash w14:val="solid"/>
+            <w14:round/>
+          </w14:textOutline>
+          <w14:textFill>
+            <w14:gradFill>
+              <w14:gsLst>
+                <w14:gs w14:pos="21000">
+                  <w14:srgbClr w14:val="53575C"/>
+                </w14:gs>
+                <w14:gs w14:pos="88000">
+                  <w14:srgbClr w14:val="C5C7CA"/>
+                </w14:gs>
+              </w14:gsLst>
+              <w14:lin w14:ang="5400000" w14:scaled="0"/>
+            </w14:gradFill>
+          </w14:textFill>
+        </w:rPr>
+        <w:t xml:space="preserve"> </w:t>
+      </w:r>
+      <w:r>
+        <w:rPr>
+          <w:b/>
+          <w:bCs/>
+          <w:color w:val="000000" w:themeColor="text1"/>
+          <w14:textOutline w14:w="0" w14:cap="flat" w14:cmpd="sng" w14:algn="ctr">
+            <w14:noFill/>
+            <w14:prstDash w14:val="solid"/>
+            <w14:round/>
+          </w14:textOutline>
+          <w14:textFill>
+            <w14:gradFill>
+              <w14:gsLst>
+                <w14:gs w14:pos="21000">
+                  <w14:srgbClr w14:val="53575C"/>
+                </w14:gs>
+                <w14:gs w14:pos="88000">
+                  <w14:srgbClr w14:val="C5C7CA"/>
+                </w14:gs>
+              </w14:gsLst>
+              <w14:lin w14:ang="5400000" w14:scaled="0"/>
+            </w14:gradFill>
+          </w14:textFill>
+        </w:rPr>
+        <w:t>URL de ton site SharePoint</w:t>
+      </w:r>
+      <w:r>
+        <w:rPr>
+          <w:color w:val="000000" w:themeColor="text1"/>
+          <w14:textOutline w14:w="0" w14:cap="flat" w14:cmpd="sng" w14:algn="ctr">
+            <w14:noFill/>
+            <w14:prstDash w14:val="solid"/>
+            <w14:round/>
+          </w14:textOutline>
+          <w14:textFill>
+            <w14:gradFill>
+              <w14:gsLst>
+                <w14:gs w14:pos="21000">
+                  <w14:srgbClr w14:val="53575C"/>
+                </w14:gs>
+                <w14:gs w14:pos="88000">
+                  <w14:srgbClr w14:val="C5C7CA"/>
+                </w14:gs>
+              </w14:gsLst>
+              <w14:lin w14:ang="5400000" w14:scaled="0"/>
+            </w14:gradFill>
+          </w14:textFill>
+        </w:rPr>
+        <w:t xml:space="preserve"> :</w:t>
+      </w:r>
+      <w:r>
+        <w:rPr>
+          <w:color w:val="000000" w:themeColor="text1"/>
+          <w14:textOutline w14:w="0" w14:cap="flat" w14:cmpd="sng" w14:algn="ctr">
+            <w14:noFill/>
+            <w14:prstDash w14:val="solid"/>
+            <w14:round/>
+          </w14:textOutline>
+          <w14:textFill>
+            <w14:gradFill>
+              <w14:gsLst>
+                <w14:gs w14:pos="21000">
+                  <w14:srgbClr w14:val="53575C"/>
+                </w14:gs>
+                <w14:gs w14:pos="88000">
+                  <w14:srgbClr w14:val="C5C7CA"/>
+                </w14:gs>
+              </w14:gsLst>
+              <w14:lin w14:ang="5400000" w14:scaled="0"/>
+            </w14:gradFill>
+          </w14:textFill>
+        </w:rPr>
+        <w:br/>
+      </w:r>
+      <w:r>
+        <w:rPr>
+          <w:rFonts w:ascii="Segoe UI Emoji" w:hAnsi="Segoe UI Emoji" w:cs="Segoe UI Emoji"/>
+          <w:color w:val="000000" w:themeColor="text1"/>
+          <w14:textOutline w14:w="0" w14:cap="flat" w14:cmpd="sng" w14:algn="ctr">
+            <w14:noFill/>
+            <w14:prstDash w14:val="solid"/>
+            <w14:round/>
+          </w14:textOutline>
+          <w14:textFill>
+            <w14:gradFill>
+              <w14:gsLst>
+                <w14:gs w14:pos="21000">
+                  <w14:srgbClr w14:val="53575C"/>
+                </w14:gs>
+                <w14:gs w14:pos="88000">
+                  <w14:srgbClr w14:val="C5C7CA"/>
+                </w14:gs>
+              </w14:gsLst>
+              <w14:lin w14:ang="5400000" w14:scaled="0"/>
+            </w14:gradFill>
+          </w14:textFill>
+        </w:rPr>
+        <w:t>👉</w:t>
+      </w:r>
+      <w:r>
+        <w:rPr>
+          <w:color w:val="000000" w:themeColor="text1"/>
+          <w14:textOutline w14:w="0" w14:cap="flat" w14:cmpd="sng" w14:algn="ctr">
+            <w14:noFill/>
+            <w14:prstDash w14:val="solid"/>
+            <w14:round/>
+          </w14:textOutline>
+          <w14:textFill>
+            <w14:gradFill>
+              <w14:gsLst>
+                <w14:gs w14:pos="21000">
+                  <w14:srgbClr w14:val="53575C"/>
+                </w14:gs>
+                <w14:gs w14:pos="88000">
+                  <w14:srgbClr w14:val="C5C7CA"/>
+                </w14:gs>
+              </w14:gsLst>
+              <w14:lin w14:ang="5400000" w14:scaled="0"/>
+            </w14:gradFill>
+          </w14:textFill>
+        </w:rPr>
+        <w:t xml:space="preserve"> https://monprojet.sharepoint.com</w:t>
+      </w:r>
+    </w:p>
+    <w:p>
+      <w:pPr>
+        <w:rPr>
+          <w:color w:val="000000" w:themeColor="text1"/>
+          <w14:textOutline w14:w="0" w14:cap="flat" w14:cmpd="sng" w14:algn="ctr">
+            <w14:noFill/>
+            <w14:prstDash w14:val="solid"/>
+            <w14:round/>
+          </w14:textOutline>
+          <w14:textFill>
+            <w14:gradFill>
+              <w14:gsLst>
+                <w14:gs w14:pos="21000">
+                  <w14:srgbClr w14:val="53575C"/>
+                </w14:gs>
+                <w14:gs w14:pos="88000">
+                  <w14:srgbClr w14:val="C5C7CA"/>
+                </w14:gs>
+              </w14:gsLst>
+              <w14:lin w14:ang="5400000" w14:scaled="0"/>
+            </w14:gradFill>
+          </w14:textFill>
+        </w:rPr>
+      </w:pPr>
+      <w:r>
+        <w:rPr>
+          <w:color w:val="000000" w:themeColor="text1"/>
+          <w14:textOutline w14:w="0" w14:cap="flat" w14:cmpd="sng" w14:algn="ctr">
+            <w14:noFill/>
+            <w14:prstDash w14:val="solid"/>
+            <w14:round/>
+          </w14:textOutline>
+          <w14:textFill>
+            <w14:gradFill>
+              <w14:gsLst>
+                <w14:gs w14:pos="21000">
+                  <w14:srgbClr w14:val="53575C"/>
+                </w14:gs>
+                <w14:gs w14:pos="88000">
+                  <w14:srgbClr w14:val="C5C7CA"/>
+                </w14:gs>
+              </w14:gsLst>
+              <w14:lin w14:ang="5400000" w14:scaled="0"/>
+            </w14:gradFill>
+          </w14:textFill>
+        </w:rPr>
+        <w:t>Pour accéder à l'administration de SharePoint Online :</w:t>
+      </w:r>
+      <w:r>
+        <w:rPr>
+          <w:color w:val="000000" w:themeColor="text1"/>
+          <w14:textOutline w14:w="0" w14:cap="flat" w14:cmpd="sng" w14:algn="ctr">
+            <w14:noFill/>
+            <w14:prstDash w14:val="solid"/>
+            <w14:round/>
+          </w14:textOutline>
+          <w14:textFill>
+            <w14:gradFill>
+              <w14:gsLst>
+                <w14:gs w14:pos="21000">
+                  <w14:srgbClr w14:val="53575C"/>
+                </w14:gs>
+                <w14:gs w14:pos="88000">
+                  <w14:srgbClr w14:val="C5C7CA"/>
+                </w14:gs>
+              </w14:gsLst>
+              <w14:lin w14:ang="5400000" w14:scaled="0"/>
+            </w14:gradFill>
+          </w14:textFill>
+        </w:rPr>
+        <w:br/>
+      </w:r>
+      <w:r>
+        <w:rPr>
+          <w:rFonts w:ascii="Segoe UI Emoji" w:hAnsi="Segoe UI Emoji" w:cs="Segoe UI Emoji"/>
+          <w:color w:val="000000" w:themeColor="text1"/>
+          <w14:textOutline w14:w="0" w14:cap="flat" w14:cmpd="sng" w14:algn="ctr">
+            <w14:noFill/>
+            <w14:prstDash w14:val="solid"/>
+            <w14:round/>
+          </w14:textOutline>
+          <w14:textFill>
+            <w14:gradFill>
+              <w14:gsLst>
+                <w14:gs w14:pos="21000">
+                  <w14:srgbClr w14:val="53575C"/>
+                </w14:gs>
+                <w14:gs w14:pos="88000">
+                  <w14:srgbClr w14:val="C5C7CA"/>
+                </w14:gs>
+              </w14:gsLst>
+              <w14:lin w14:ang="5400000" w14:scaled="0"/>
+            </w14:gradFill>
+          </w14:textFill>
+        </w:rPr>
+        <w:t>👉</w:t>
+      </w:r>
+      <w:r>
+        <w:rPr>
+          <w:color w:val="000000" w:themeColor="text1"/>
+          <w14:textOutline w14:w="0" w14:cap="flat" w14:cmpd="sng" w14:algn="ctr">
+            <w14:noFill/>
+            <w14:prstDash w14:val="solid"/>
+            <w14:round/>
+          </w14:textOutline>
+          <w14:textFill>
+            <w14:gradFill>
+              <w14:gsLst>
+                <w14:gs w14:pos="21000">
+                  <w14:srgbClr w14:val="53575C"/>
+                </w14:gs>
+                <w14:gs w14:pos="88000">
+                  <w14:srgbClr w14:val="C5C7CA"/>
+                </w14:gs>
+              </w14:gsLst>
+              <w14:lin w14:ang="5400000" w14:scaled="0"/>
+            </w14:gradFill>
+          </w14:textFill>
+        </w:rPr>
+        <w:t xml:space="preserve"> https://admin.microsoft.com (Section </w:t>
+      </w:r>
+      <w:r>
+        <w:rPr>
+          <w:b/>
+          <w:bCs/>
+          <w:color w:val="000000" w:themeColor="text1"/>
+          <w14:textOutline w14:w="0" w14:cap="flat" w14:cmpd="sng" w14:algn="ctr">
+            <w14:noFill/>
+            <w14:prstDash w14:val="solid"/>
+            <w14:round/>
+          </w14:textOutline>
+          <w14:textFill>
+            <w14:gradFill>
+              <w14:gsLst>
+                <w14:gs w14:pos="21000">
+                  <w14:srgbClr w14:val="53575C"/>
+                </w14:gs>
+                <w14:gs w14:pos="88000">
+                  <w14:srgbClr w14:val="C5C7CA"/>
+                </w14:gs>
+              </w14:gsLst>
+              <w14:lin w14:ang="5400000" w14:scaled="0"/>
+            </w14:gradFill>
+          </w14:textFill>
+        </w:rPr>
+        <w:t>SharePoint</w:t>
+      </w:r>
+      <w:r>
+        <w:rPr>
+          <w:color w:val="000000" w:themeColor="text1"/>
+          <w14:textOutline w14:w="0" w14:cap="flat" w14:cmpd="sng" w14:algn="ctr">
+            <w14:noFill/>
+            <w14:prstDash w14:val="solid"/>
+            <w14:round/>
+          </w14:textOutline>
+          <w14:textFill>
+            <w14:gradFill>
+              <w14:gsLst>
+                <w14:gs w14:pos="21000">
+                  <w14:srgbClr w14:val="53575C"/>
+                </w14:gs>
+                <w14:gs w14:pos="88000">
+                  <w14:srgbClr w14:val="C5C7CA"/>
+                </w14:gs>
+              </w14:gsLst>
+              <w14:lin w14:ang="5400000" w14:scaled="0"/>
+            </w14:gradFill>
+          </w14:textFill>
+        </w:rPr>
+        <w:t>)</w:t>
+      </w:r>
+    </w:p>
+    <w:p>
+      <w:pPr>
+        <w:rPr>
+          <w:b/>
+          <w:bCs/>
+          <w:color w:val="000000" w:themeColor="text1"/>
+          <w14:textOutline w14:w="0" w14:cap="flat" w14:cmpd="sng" w14:algn="ctr">
+            <w14:noFill/>
+            <w14:prstDash w14:val="solid"/>
+            <w14:round/>
+          </w14:textOutline>
+          <w14:textFill>
+            <w14:gradFill>
+              <w14:gsLst>
+                <w14:gs w14:pos="21000">
+                  <w14:srgbClr w14:val="53575C"/>
+                </w14:gs>
+                <w14:gs w14:pos="88000">
+                  <w14:srgbClr w14:val="C5C7CA"/>
+                </w14:gs>
+              </w14:gsLst>
+              <w14:lin w14:ang="5400000" w14:scaled="0"/>
+            </w14:gradFill>
+          </w14:textFill>
+        </w:rPr>
+      </w:pPr>
+      <w:r>
+        <w:rPr>
+          <w:b/>
+          <w:bCs/>
+          <w:color w:val="000000" w:themeColor="text1"/>
+          <w14:textOutline w14:w="0" w14:cap="flat" w14:cmpd="sng" w14:algn="ctr">
+            <w14:noFill/>
+            <w14:prstDash w14:val="solid"/>
+            <w14:round/>
+          </w14:textOutline>
+          <w14:textFill>
+            <w14:gradFill>
+              <w14:gsLst>
+                <w14:gs w14:pos="21000">
+                  <w14:srgbClr w14:val="53575C"/>
+                </w14:gs>
+                <w14:gs w14:pos="88000">
+                  <w14:srgbClr w14:val="C5C7CA"/>
+                </w14:gs>
+              </w14:gsLst>
+              <w14:lin w14:ang="5400000" w14:scaled="0"/>
+            </w14:gradFill>
+          </w14:textFill>
+        </w:rPr>
+        <w:t>4️</w:t>
+      </w:r>
+      <w:r>
+        <w:rPr>
+          <w:rFonts w:ascii="Segoe UI Symbol" w:hAnsi="Segoe UI Symbol" w:cs="Segoe UI Symbol"/>
+          <w:b/>
+          <w:bCs/>
+          <w:color w:val="000000" w:themeColor="text1"/>
+          <w14:textOutline w14:w="0" w14:cap="flat" w14:cmpd="sng" w14:algn="ctr">
+            <w14:noFill/>
+            <w14:prstDash w14:val="solid"/>
+            <w14:round/>
+          </w14:textOutline>
+          <w14:textFill>
+            <w14:gradFill>
+              <w14:gsLst>
+                <w14:gs w14:pos="21000">
+                  <w14:srgbClr w14:val="53575C"/>
+                </w14:gs>
+                <w14:gs w14:pos="88000">
+                  <w14:srgbClr w14:val="C5C7CA"/>
+                </w14:gs>
+              </w14:gsLst>
+              <w14:lin w14:ang="5400000" w14:scaled="0"/>
+            </w14:gradFill>
+          </w14:textFill>
+        </w:rPr>
+        <w:t>⃣</w:t>
+      </w:r>
+      <w:r>
+        <w:rPr>
+          <w:b/>
+          <w:bCs/>
+          <w:color w:val="000000" w:themeColor="text1"/>
+          <w14:textOutline w14:w="0" w14:cap="flat" w14:cmpd="sng" w14:algn="ctr">
+            <w14:noFill/>
+            <w14:prstDash w14:val="solid"/>
+            <w14:round/>
+          </w14:textOutline>
+          <w14:textFill>
+            <w14:gradFill>
+              <w14:gsLst>
+                <w14:gs w14:pos="21000">
+                  <w14:srgbClr w14:val="53575C"/>
+                </w14:gs>
+                <w14:gs w14:pos="88000">
+                  <w14:srgbClr w14:val="C5C7CA"/>
+                </w14:gs>
+              </w14:gsLst>
+              <w14:lin w14:ang="5400000" w14:scaled="0"/>
+            </w14:gradFill>
+          </w14:textFill>
+        </w:rPr>
+        <w:t xml:space="preserve"> Déployer tes Web Parts </w:t>
+      </w:r>
+      <w:proofErr w:type="spellStart"/>
+      <w:r>
+        <w:rPr>
+          <w:b/>
+          <w:bCs/>
+          <w:color w:val="000000" w:themeColor="text1"/>
+          <w14:textOutline w14:w="0" w14:cap="flat" w14:cmpd="sng" w14:algn="ctr">
+            <w14:noFill/>
+            <w14:prstDash w14:val="solid"/>
+            <w14:round/>
+          </w14:textOutline>
+          <w14:textFill>
+            <w14:gradFill>
+              <w14:gsLst>
+                <w14:gs w14:pos="21000">
+                  <w14:srgbClr w14:val="53575C"/>
+                </w14:gs>
+                <w14:gs w14:pos="88000">
+                  <w14:srgbClr w14:val="C5C7CA"/>
+                </w14:gs>
+              </w14:gsLst>
+              <w14:lin w14:ang="5400000" w14:scaled="0"/>
+            </w14:gradFill>
+          </w14:textFill>
+        </w:rPr>
+        <w:t>SPFx</w:t>
+      </w:r>
+      <w:proofErr w:type="spellEnd"/>
+    </w:p>
+    <w:p>
+      <w:pPr>
+        <w:rPr>
+          <w:color w:val="000000" w:themeColor="text1"/>
+          <w14:textOutline w14:w="0" w14:cap="flat" w14:cmpd="sng" w14:algn="ctr">
+            <w14:noFill/>
+            <w14:prstDash w14:val="solid"/>
+            <w14:round/>
+          </w14:textOutline>
+          <w14:textFill>
+            <w14:gradFill>
+              <w14:gsLst>
+                <w14:gs w14:pos="21000">
+                  <w14:srgbClr w14:val="53575C"/>
+                </w14:gs>
+                <w14:gs w14:pos="88000">
+                  <w14:srgbClr w14:val="C5C7CA"/>
+                </w14:gs>
+              </w14:gsLst>
+              <w14:lin w14:ang="5400000" w14:scaled="0"/>
+            </w14:gradFill>
+          </w14:textFill>
+        </w:rPr>
+      </w:pPr>
+      <w:r>
+        <w:rPr>
+          <w:color w:val="000000" w:themeColor="text1"/>
+          <w14:textOutline w14:w="0" w14:cap="flat" w14:cmpd="sng" w14:algn="ctr">
+            <w14:noFill/>
+            <w14:prstDash w14:val="solid"/>
+            <w14:round/>
+          </w14:textOutline>
+          <w14:textFill>
+            <w14:gradFill>
+              <w14:gsLst>
+                <w14:gs w14:pos="21000">
+                  <w14:srgbClr w14:val="53575C"/>
+                </w14:gs>
+                <w14:gs w14:pos="88000">
+                  <w14:srgbClr w14:val="C5C7CA"/>
+                </w14:gs>
+              </w14:gsLst>
+              <w14:lin w14:ang="5400000" w14:scaled="0"/>
+            </w14:gradFill>
+          </w14:textFill>
+        </w:rPr>
+        <w:t>Maintenant que tu as ton Tenant, tu peux :</w:t>
+      </w:r>
+    </w:p>
+    <w:p>
+      <w:pPr>
+        <w:numPr>
+          <w:ilvl w:val="0"/>
+          <w:numId w:val="11"/>
+        </w:numPr>
+        <w:rPr>
+          <w:color w:val="000000" w:themeColor="text1"/>
+          <w14:textOutline w14:w="0" w14:cap="flat" w14:cmpd="sng" w14:algn="ctr">
+            <w14:noFill/>
+            <w14:prstDash w14:val="solid"/>
+            <w14:round/>
+          </w14:textOutline>
+          <w14:textFill>
+            <w14:gradFill>
+              <w14:gsLst>
+                <w14:gs w14:pos="21000">
+                  <w14:srgbClr w14:val="53575C"/>
+                </w14:gs>
+                <w14:gs w14:pos="88000">
+                  <w14:srgbClr w14:val="C5C7CA"/>
+                </w14:gs>
+              </w14:gsLst>
+              <w14:lin w14:ang="5400000" w14:scaled="0"/>
+            </w14:gradFill>
+          </w14:textFill>
+        </w:rPr>
+      </w:pPr>
+      <w:r>
+        <w:rPr>
+          <w:b/>
+          <w:bCs/>
+          <w:color w:val="000000" w:themeColor="text1"/>
+          <w14:textOutline w14:w="0" w14:cap="flat" w14:cmpd="sng" w14:algn="ctr">
+            <w14:noFill/>
+            <w14:prstDash w14:val="solid"/>
+            <w14:round/>
+          </w14:textOutline>
+          <w14:textFill>
+            <w14:gradFill>
+              <w14:gsLst>
+                <w14:gs w14:pos="21000">
+                  <w14:srgbClr w14:val="53575C"/>
+                </w14:gs>
+                <w14:gs w14:pos="88000">
+                  <w14:srgbClr w14:val="C5C7CA"/>
+                </w14:gs>
+              </w14:gsLst>
+              <w14:lin w14:ang="5400000" w14:scaled="0"/>
+            </w14:gradFill>
+          </w14:textFill>
+        </w:rPr>
+        <w:t>Créer un site SharePoint</w:t>
+      </w:r>
+    </w:p>
+    <w:p>
+      <w:pPr>
+        <w:numPr>
+          <w:ilvl w:val="0"/>
+          <w:numId w:val="11"/>
+        </w:numPr>
+        <w:rPr>
+          <w:color w:val="000000" w:themeColor="text1"/>
+          <w14:textOutline w14:w="0" w14:cap="flat" w14:cmpd="sng" w14:algn="ctr">
+            <w14:noFill/>
+            <w14:prstDash w14:val="solid"/>
+            <w14:round/>
+          </w14:textOutline>
+          <w14:textFill>
+            <w14:gradFill>
+              <w14:gsLst>
+                <w14:gs w14:pos="21000">
+                  <w14:srgbClr w14:val="53575C"/>
+                </w14:gs>
+                <w14:gs w14:pos="88000">
+                  <w14:srgbClr w14:val="C5C7CA"/>
+                </w14:gs>
+              </w14:gsLst>
+              <w14:lin w14:ang="5400000" w14:scaled="0"/>
+            </w14:gradFill>
+          </w14:textFill>
+        </w:rPr>
+      </w:pPr>
+      <w:r>
+        <w:rPr>
+          <w:b/>
+          <w:bCs/>
+          <w:color w:val="000000" w:themeColor="text1"/>
+          <w14:textOutline w14:w="0" w14:cap="flat" w14:cmpd="sng" w14:algn="ctr">
+            <w14:noFill/>
+            <w14:prstDash w14:val="solid"/>
+            <w14:round/>
+          </w14:textOutline>
+          <w14:textFill>
+            <w14:gradFill>
+              <w14:gsLst>
+                <w14:gs w14:pos="21000">
+                  <w14:srgbClr w14:val="53575C"/>
+                </w14:gs>
+                <w14:gs w14:pos="88000">
+                  <w14:srgbClr w14:val="C5C7CA"/>
+                </w14:gs>
+              </w14:gsLst>
+              <w14:lin w14:ang="5400000" w14:scaled="0"/>
+            </w14:gradFill>
+          </w14:textFill>
+        </w:rPr>
+        <w:t xml:space="preserve">Développer des Web Parts </w:t>
+      </w:r>
+      <w:proofErr w:type="spellStart"/>
+      <w:r>
+        <w:rPr>
+          <w:b/>
+          <w:bCs/>
+          <w:color w:val="000000" w:themeColor="text1"/>
+          <w14:textOutline w14:w="0" w14:cap="flat" w14:cmpd="sng" w14:algn="ctr">
+            <w14:noFill/>
+            <w14:prstDash w14:val="solid"/>
+            <w14:round/>
+          </w14:textOutline>
+          <w14:textFill>
+            <w14:gradFill>
+              <w14:gsLst>
+                <w14:gs w14:pos="21000">
+                  <w14:srgbClr w14:val="53575C"/>
+                </w14:gs>
+                <w14:gs w14:pos="88000">
+                  <w14:srgbClr w14:val="C5C7CA"/>
+                </w14:gs>
+              </w14:gsLst>
+              <w14:lin w14:ang="5400000" w14:scaled="0"/>
+            </w14:gradFill>
+          </w14:textFill>
+        </w:rPr>
+        <w:t>SPFx</w:t>
+      </w:r>
+      <w:proofErr w:type="spellEnd"/>
+      <w:r>
+        <w:rPr>
+          <w:color w:val="000000" w:themeColor="text1"/>
+          <w14:textOutline w14:w="0" w14:cap="flat" w14:cmpd="sng" w14:algn="ctr">
+            <w14:noFill/>
+            <w14:prstDash w14:val="solid"/>
+            <w14:round/>
+          </w14:textOutline>
+          <w14:textFill>
+            <w14:gradFill>
+              <w14:gsLst>
+                <w14:gs w14:pos="21000">
+                  <w14:srgbClr w14:val="53575C"/>
+                </w14:gs>
+                <w14:gs w14:pos="88000">
+                  <w14:srgbClr w14:val="C5C7CA"/>
+                </w14:gs>
+              </w14:gsLst>
+              <w14:lin w14:ang="5400000" w14:scaled="0"/>
+            </w14:gradFill>
+          </w14:textFill>
+        </w:rPr>
+        <w:t xml:space="preserve"> avec </w:t>
+      </w:r>
+      <w:r>
+        <w:rPr>
+          <w:b/>
+          <w:bCs/>
+          <w:color w:val="000000" w:themeColor="text1"/>
+          <w14:textOutline w14:w="0" w14:cap="flat" w14:cmpd="sng" w14:algn="ctr">
+            <w14:noFill/>
+            <w14:prstDash w14:val="solid"/>
+            <w14:round/>
+          </w14:textOutline>
+          <w14:textFill>
+            <w14:gradFill>
+              <w14:gsLst>
+                <w14:gs w14:pos="21000">
+                  <w14:srgbClr w14:val="53575C"/>
+                </w14:gs>
+                <w14:gs w14:pos="88000">
+                  <w14:srgbClr w14:val="C5C7CA"/>
+                </w14:gs>
+              </w14:gsLst>
+              <w14:lin w14:ang="5400000" w14:scaled="0"/>
+            </w14:gradFill>
+          </w14:textFill>
+        </w:rPr>
+        <w:t xml:space="preserve">Yeoman </w:t>
+      </w:r>
+      <w:proofErr w:type="spellStart"/>
+      <w:r>
+        <w:rPr>
+          <w:b/>
+          <w:bCs/>
+          <w:color w:val="000000" w:themeColor="text1"/>
+          <w14:textOutline w14:w="0" w14:cap="flat" w14:cmpd="sng" w14:algn="ctr">
+            <w14:noFill/>
+            <w14:prstDash w14:val="solid"/>
+            <w14:round/>
+          </w14:textOutline>
+          <w14:textFill>
+            <w14:gradFill>
+              <w14:gsLst>
+                <w14:gs w14:pos="21000">
+                  <w14:srgbClr w14:val="53575C"/>
+                </w14:gs>
+                <w14:gs w14:pos="88000">
+                  <w14:srgbClr w14:val="C5C7CA"/>
+                </w14:gs>
+              </w14:gsLst>
+              <w14:lin w14:ang="5400000" w14:scaled="0"/>
+            </w14:gradFill>
+          </w14:textFill>
+        </w:rPr>
+        <w:t>Generator</w:t>
+      </w:r>
+      <w:proofErr w:type="spellEnd"/>
+    </w:p>
+    <w:p>
+      <w:pPr>
+        <w:numPr>
+          <w:ilvl w:val="0"/>
+          <w:numId w:val="11"/>
+        </w:numPr>
+        <w:rPr>
+          <w:color w:val="000000" w:themeColor="text1"/>
+          <w14:textOutline w14:w="0" w14:cap="flat" w14:cmpd="sng" w14:algn="ctr">
+            <w14:noFill/>
+            <w14:prstDash w14:val="solid"/>
+            <w14:round/>
+          </w14:textOutline>
+          <w14:textFill>
+            <w14:gradFill>
+              <w14:gsLst>
+                <w14:gs w14:pos="21000">
+                  <w14:srgbClr w14:val="53575C"/>
+                </w14:gs>
+                <w14:gs w14:pos="88000">
+                  <w14:srgbClr w14:val="C5C7CA"/>
+                </w14:gs>
+              </w14:gsLst>
+              <w14:lin w14:ang="5400000" w14:scaled="0"/>
+            </w14:gradFill>
+          </w14:textFill>
+        </w:rPr>
+      </w:pPr>
+      <w:r>
+        <w:rPr>
+          <w:b/>
+          <w:bCs/>
+          <w:color w:val="000000" w:themeColor="text1"/>
+          <w14:textOutline w14:w="0" w14:cap="flat" w14:cmpd="sng" w14:algn="ctr">
+            <w14:noFill/>
+            <w14:prstDash w14:val="solid"/>
+            <w14:round/>
+          </w14:textOutline>
+          <w14:textFill>
+            <w14:gradFill>
+              <w14:gsLst>
+                <w14:gs w14:pos="21000">
+                  <w14:srgbClr w14:val="53575C"/>
+                </w14:gs>
+                <w14:gs w14:pos="88000">
+                  <w14:srgbClr w14:val="C5C7CA"/>
+                </w14:gs>
+              </w14:gsLst>
+              <w14:lin w14:ang="5400000" w14:scaled="0"/>
+            </w14:gradFill>
+          </w14:textFill>
+        </w:rPr>
+        <w:t xml:space="preserve">Déployer tes Web Parts sur l'App </w:t>
+      </w:r>
+      <w:proofErr w:type="spellStart"/>
+      <w:r>
+        <w:rPr>
+          <w:b/>
+          <w:bCs/>
+          <w:color w:val="000000" w:themeColor="text1"/>
+          <w14:textOutline w14:w="0" w14:cap="flat" w14:cmpd="sng" w14:algn="ctr">
+            <w14:noFill/>
+            <w14:prstDash w14:val="solid"/>
+            <w14:round/>
+          </w14:textOutline>
+          <w14:textFill>
+            <w14:gradFill>
+              <w14:gsLst>
+                <w14:gs w14:pos="21000">
+                  <w14:srgbClr w14:val="53575C"/>
+                </w14:gs>
+                <w14:gs w14:pos="88000">
+                  <w14:srgbClr w14:val="C5C7CA"/>
+                </w14:gs>
+              </w14:gsLst>
+              <w14:lin w14:ang="5400000" w14:scaled="0"/>
+            </w14:gradFill>
+          </w14:textFill>
+        </w:rPr>
+        <w:t>Catalog</w:t>
+      </w:r>
+      <w:proofErr w:type="spellEnd"/>
+      <w:r>
+        <w:rPr>
+          <w:b/>
+          <w:bCs/>
+          <w:color w:val="000000" w:themeColor="text1"/>
+          <w14:textOutline w14:w="0" w14:cap="flat" w14:cmpd="sng" w14:algn="ctr">
+            <w14:noFill/>
+            <w14:prstDash w14:val="solid"/>
+            <w14:round/>
+          </w14:textOutline>
+          <w14:textFill>
+            <w14:gradFill>
+              <w14:gsLst>
+                <w14:gs w14:pos="21000">
+                  <w14:srgbClr w14:val="53575C"/>
+                </w14:gs>
+                <w14:gs w14:pos="88000">
+                  <w14:srgbClr w14:val="C5C7CA"/>
+                </w14:gs>
+              </w14:gsLst>
+              <w14:lin w14:ang="5400000" w14:scaled="0"/>
+            </w14:gradFill>
+          </w14:textFill>
+        </w:rPr>
+        <w:t xml:space="preserve"> de SharePoint</w:t>
       </w:r>
     </w:p>
     <w:p>
@@ -5672,6 +9169,155 @@
     </w:lvl>
   </w:abstractNum>
   <w:abstractNum w:abstractNumId="2" w15:restartNumberingAfterBreak="0">
+    <w:nsid w:val="19B02F4F"/>
+    <w:multiLevelType w:val="multilevel"/>
+    <w:tmpl w:val="65A28E98"/>
+    <w:lvl w:ilvl="0">
+      <w:start w:val="1"/>
+      <w:numFmt w:val="bullet"/>
+      <w:lvlText w:val=""/>
+      <w:lvlJc w:val="left"/>
+      <w:pPr>
+        <w:tabs>
+          <w:tab w:val="num" w:pos="720"/>
+        </w:tabs>
+        <w:ind w:left="720" w:hanging="360"/>
+      </w:pPr>
+      <w:rPr>
+        <w:rFonts w:ascii="Symbol" w:hAnsi="Symbol" w:hint="default"/>
+        <w:sz w:val="20"/>
+      </w:rPr>
+    </w:lvl>
+    <w:lvl w:ilvl="1" w:tentative="1">
+      <w:start w:val="1"/>
+      <w:numFmt w:val="bullet"/>
+      <w:lvlText w:val="o"/>
+      <w:lvlJc w:val="left"/>
+      <w:pPr>
+        <w:tabs>
+          <w:tab w:val="num" w:pos="1440"/>
+        </w:tabs>
+        <w:ind w:left="1440" w:hanging="360"/>
+      </w:pPr>
+      <w:rPr>
+        <w:rFonts w:ascii="Courier New" w:hAnsi="Courier New" w:hint="default"/>
+        <w:sz w:val="20"/>
+      </w:rPr>
+    </w:lvl>
+    <w:lvl w:ilvl="2" w:tentative="1">
+      <w:start w:val="1"/>
+      <w:numFmt w:val="bullet"/>
+      <w:lvlText w:val=""/>
+      <w:lvlJc w:val="left"/>
+      <w:pPr>
+        <w:tabs>
+          <w:tab w:val="num" w:pos="2160"/>
+        </w:tabs>
+        <w:ind w:left="2160" w:hanging="360"/>
+      </w:pPr>
+      <w:rPr>
+        <w:rFonts w:ascii="Wingdings" w:hAnsi="Wingdings" w:hint="default"/>
+        <w:sz w:val="20"/>
+      </w:rPr>
+    </w:lvl>
+    <w:lvl w:ilvl="3" w:tentative="1">
+      <w:start w:val="1"/>
+      <w:numFmt w:val="bullet"/>
+      <w:lvlText w:val=""/>
+      <w:lvlJc w:val="left"/>
+      <w:pPr>
+        <w:tabs>
+          <w:tab w:val="num" w:pos="2880"/>
+        </w:tabs>
+        <w:ind w:left="2880" w:hanging="360"/>
+      </w:pPr>
+      <w:rPr>
+        <w:rFonts w:ascii="Wingdings" w:hAnsi="Wingdings" w:hint="default"/>
+        <w:sz w:val="20"/>
+      </w:rPr>
+    </w:lvl>
+    <w:lvl w:ilvl="4" w:tentative="1">
+      <w:start w:val="1"/>
+      <w:numFmt w:val="bullet"/>
+      <w:lvlText w:val=""/>
+      <w:lvlJc w:val="left"/>
+      <w:pPr>
+        <w:tabs>
+          <w:tab w:val="num" w:pos="3600"/>
+        </w:tabs>
+        <w:ind w:left="3600" w:hanging="360"/>
+      </w:pPr>
+      <w:rPr>
+        <w:rFonts w:ascii="Wingdings" w:hAnsi="Wingdings" w:hint="default"/>
+        <w:sz w:val="20"/>
+      </w:rPr>
+    </w:lvl>
+    <w:lvl w:ilvl="5" w:tentative="1">
+      <w:start w:val="1"/>
+      <w:numFmt w:val="bullet"/>
+      <w:lvlText w:val=""/>
+      <w:lvlJc w:val="left"/>
+      <w:pPr>
+        <w:tabs>
+          <w:tab w:val="num" w:pos="4320"/>
+        </w:tabs>
+        <w:ind w:left="4320" w:hanging="360"/>
+      </w:pPr>
+      <w:rPr>
+        <w:rFonts w:ascii="Wingdings" w:hAnsi="Wingdings" w:hint="default"/>
+        <w:sz w:val="20"/>
+      </w:rPr>
+    </w:lvl>
+    <w:lvl w:ilvl="6" w:tentative="1">
+      <w:start w:val="1"/>
+      <w:numFmt w:val="bullet"/>
+      <w:lvlText w:val=""/>
+      <w:lvlJc w:val="left"/>
+      <w:pPr>
+        <w:tabs>
+          <w:tab w:val="num" w:pos="5040"/>
+        </w:tabs>
+        <w:ind w:left="5040" w:hanging="360"/>
+      </w:pPr>
+      <w:rPr>
+        <w:rFonts w:ascii="Wingdings" w:hAnsi="Wingdings" w:hint="default"/>
+        <w:sz w:val="20"/>
+      </w:rPr>
+    </w:lvl>
+    <w:lvl w:ilvl="7" w:tentative="1">
+      <w:start w:val="1"/>
+      <w:numFmt w:val="bullet"/>
+      <w:lvlText w:val=""/>
+      <w:lvlJc w:val="left"/>
+      <w:pPr>
+        <w:tabs>
+          <w:tab w:val="num" w:pos="5760"/>
+        </w:tabs>
+        <w:ind w:left="5760" w:hanging="360"/>
+      </w:pPr>
+      <w:rPr>
+        <w:rFonts w:ascii="Wingdings" w:hAnsi="Wingdings" w:hint="default"/>
+        <w:sz w:val="20"/>
+      </w:rPr>
+    </w:lvl>
+    <w:lvl w:ilvl="8" w:tentative="1">
+      <w:start w:val="1"/>
+      <w:numFmt w:val="bullet"/>
+      <w:lvlText w:val=""/>
+      <w:lvlJc w:val="left"/>
+      <w:pPr>
+        <w:tabs>
+          <w:tab w:val="num" w:pos="6480"/>
+        </w:tabs>
+        <w:ind w:left="6480" w:hanging="360"/>
+      </w:pPr>
+      <w:rPr>
+        <w:rFonts w:ascii="Wingdings" w:hAnsi="Wingdings" w:hint="default"/>
+        <w:sz w:val="20"/>
+      </w:rPr>
+    </w:lvl>
+  </w:abstractNum>
+  <w:abstractNum w:abstractNumId="3" w15:restartNumberingAfterBreak="0">
     <w:nsid w:val="1F27543E"/>
     <w:multiLevelType w:val="multilevel"/>
     <w:tmpl w:val="1DB04A14"/>
@@ -5784,7 +9430,7 @@
       </w:pPr>
     </w:lvl>
   </w:abstractNum>
-  <w:abstractNum w:abstractNumId="3" w15:restartNumberingAfterBreak="0">
+  <w:abstractNum w:abstractNumId="4" w15:restartNumberingAfterBreak="0">
     <w:nsid w:val="3594205E"/>
     <w:multiLevelType w:val="multilevel"/>
     <w:tmpl w:val="E9B66B10"/>
@@ -5897,7 +9543,7 @@
       </w:pPr>
     </w:lvl>
   </w:abstractNum>
-  <w:abstractNum w:abstractNumId="4" w15:restartNumberingAfterBreak="0">
+  <w:abstractNum w:abstractNumId="5" w15:restartNumberingAfterBreak="0">
     <w:nsid w:val="461B2E87"/>
     <w:multiLevelType w:val="multilevel"/>
     <w:tmpl w:val="4BC2DFFA"/>
@@ -6014,7 +9660,7 @@
       </w:pPr>
     </w:lvl>
   </w:abstractNum>
-  <w:abstractNum w:abstractNumId="5" w15:restartNumberingAfterBreak="0">
+  <w:abstractNum w:abstractNumId="6" w15:restartNumberingAfterBreak="0">
     <w:nsid w:val="51155F7B"/>
     <w:multiLevelType w:val="multilevel"/>
     <w:tmpl w:val="7E784486"/>
@@ -6127,7 +9773,305 @@
       </w:pPr>
     </w:lvl>
   </w:abstractNum>
-  <w:abstractNum w:abstractNumId="6" w15:restartNumberingAfterBreak="0">
+  <w:abstractNum w:abstractNumId="7" w15:restartNumberingAfterBreak="0">
+    <w:nsid w:val="5794161B"/>
+    <w:multiLevelType w:val="multilevel"/>
+    <w:tmpl w:val="92C885E4"/>
+    <w:lvl w:ilvl="0">
+      <w:start w:val="1"/>
+      <w:numFmt w:val="bullet"/>
+      <w:lvlText w:val=""/>
+      <w:lvlJc w:val="left"/>
+      <w:pPr>
+        <w:tabs>
+          <w:tab w:val="num" w:pos="720"/>
+        </w:tabs>
+        <w:ind w:left="720" w:hanging="360"/>
+      </w:pPr>
+      <w:rPr>
+        <w:rFonts w:ascii="Symbol" w:hAnsi="Symbol" w:hint="default"/>
+        <w:sz w:val="20"/>
+      </w:rPr>
+    </w:lvl>
+    <w:lvl w:ilvl="1" w:tentative="1">
+      <w:start w:val="1"/>
+      <w:numFmt w:val="bullet"/>
+      <w:lvlText w:val="o"/>
+      <w:lvlJc w:val="left"/>
+      <w:pPr>
+        <w:tabs>
+          <w:tab w:val="num" w:pos="1440"/>
+        </w:tabs>
+        <w:ind w:left="1440" w:hanging="360"/>
+      </w:pPr>
+      <w:rPr>
+        <w:rFonts w:ascii="Courier New" w:hAnsi="Courier New" w:hint="default"/>
+        <w:sz w:val="20"/>
+      </w:rPr>
+    </w:lvl>
+    <w:lvl w:ilvl="2" w:tentative="1">
+      <w:start w:val="1"/>
+      <w:numFmt w:val="bullet"/>
+      <w:lvlText w:val=""/>
+      <w:lvlJc w:val="left"/>
+      <w:pPr>
+        <w:tabs>
+          <w:tab w:val="num" w:pos="2160"/>
+        </w:tabs>
+        <w:ind w:left="2160" w:hanging="360"/>
+      </w:pPr>
+      <w:rPr>
+        <w:rFonts w:ascii="Wingdings" w:hAnsi="Wingdings" w:hint="default"/>
+        <w:sz w:val="20"/>
+      </w:rPr>
+    </w:lvl>
+    <w:lvl w:ilvl="3" w:tentative="1">
+      <w:start w:val="1"/>
+      <w:numFmt w:val="bullet"/>
+      <w:lvlText w:val=""/>
+      <w:lvlJc w:val="left"/>
+      <w:pPr>
+        <w:tabs>
+          <w:tab w:val="num" w:pos="2880"/>
+        </w:tabs>
+        <w:ind w:left="2880" w:hanging="360"/>
+      </w:pPr>
+      <w:rPr>
+        <w:rFonts w:ascii="Wingdings" w:hAnsi="Wingdings" w:hint="default"/>
+        <w:sz w:val="20"/>
+      </w:rPr>
+    </w:lvl>
+    <w:lvl w:ilvl="4" w:tentative="1">
+      <w:start w:val="1"/>
+      <w:numFmt w:val="bullet"/>
+      <w:lvlText w:val=""/>
+      <w:lvlJc w:val="left"/>
+      <w:pPr>
+        <w:tabs>
+          <w:tab w:val="num" w:pos="3600"/>
+        </w:tabs>
+        <w:ind w:left="3600" w:hanging="360"/>
+      </w:pPr>
+      <w:rPr>
+        <w:rFonts w:ascii="Wingdings" w:hAnsi="Wingdings" w:hint="default"/>
+        <w:sz w:val="20"/>
+      </w:rPr>
+    </w:lvl>
+    <w:lvl w:ilvl="5" w:tentative="1">
+      <w:start w:val="1"/>
+      <w:numFmt w:val="bullet"/>
+      <w:lvlText w:val=""/>
+      <w:lvlJc w:val="left"/>
+      <w:pPr>
+        <w:tabs>
+          <w:tab w:val="num" w:pos="4320"/>
+        </w:tabs>
+        <w:ind w:left="4320" w:hanging="360"/>
+      </w:pPr>
+      <w:rPr>
+        <w:rFonts w:ascii="Wingdings" w:hAnsi="Wingdings" w:hint="default"/>
+        <w:sz w:val="20"/>
+      </w:rPr>
+    </w:lvl>
+    <w:lvl w:ilvl="6" w:tentative="1">
+      <w:start w:val="1"/>
+      <w:numFmt w:val="bullet"/>
+      <w:lvlText w:val=""/>
+      <w:lvlJc w:val="left"/>
+      <w:pPr>
+        <w:tabs>
+          <w:tab w:val="num" w:pos="5040"/>
+        </w:tabs>
+        <w:ind w:left="5040" w:hanging="360"/>
+      </w:pPr>
+      <w:rPr>
+        <w:rFonts w:ascii="Wingdings" w:hAnsi="Wingdings" w:hint="default"/>
+        <w:sz w:val="20"/>
+      </w:rPr>
+    </w:lvl>
+    <w:lvl w:ilvl="7" w:tentative="1">
+      <w:start w:val="1"/>
+      <w:numFmt w:val="bullet"/>
+      <w:lvlText w:val=""/>
+      <w:lvlJc w:val="left"/>
+      <w:pPr>
+        <w:tabs>
+          <w:tab w:val="num" w:pos="5760"/>
+        </w:tabs>
+        <w:ind w:left="5760" w:hanging="360"/>
+      </w:pPr>
+      <w:rPr>
+        <w:rFonts w:ascii="Wingdings" w:hAnsi="Wingdings" w:hint="default"/>
+        <w:sz w:val="20"/>
+      </w:rPr>
+    </w:lvl>
+    <w:lvl w:ilvl="8" w:tentative="1">
+      <w:start w:val="1"/>
+      <w:numFmt w:val="bullet"/>
+      <w:lvlText w:val=""/>
+      <w:lvlJc w:val="left"/>
+      <w:pPr>
+        <w:tabs>
+          <w:tab w:val="num" w:pos="6480"/>
+        </w:tabs>
+        <w:ind w:left="6480" w:hanging="360"/>
+      </w:pPr>
+      <w:rPr>
+        <w:rFonts w:ascii="Wingdings" w:hAnsi="Wingdings" w:hint="default"/>
+        <w:sz w:val="20"/>
+      </w:rPr>
+    </w:lvl>
+  </w:abstractNum>
+  <w:abstractNum w:abstractNumId="8" w15:restartNumberingAfterBreak="0">
+    <w:nsid w:val="68346E34"/>
+    <w:multiLevelType w:val="multilevel"/>
+    <w:tmpl w:val="26FAD25A"/>
+    <w:lvl w:ilvl="0">
+      <w:start w:val="1"/>
+      <w:numFmt w:val="bullet"/>
+      <w:lvlText w:val=""/>
+      <w:lvlJc w:val="left"/>
+      <w:pPr>
+        <w:tabs>
+          <w:tab w:val="num" w:pos="720"/>
+        </w:tabs>
+        <w:ind w:left="720" w:hanging="360"/>
+      </w:pPr>
+      <w:rPr>
+        <w:rFonts w:ascii="Symbol" w:hAnsi="Symbol" w:hint="default"/>
+        <w:sz w:val="20"/>
+      </w:rPr>
+    </w:lvl>
+    <w:lvl w:ilvl="1" w:tentative="1">
+      <w:start w:val="1"/>
+      <w:numFmt w:val="bullet"/>
+      <w:lvlText w:val="o"/>
+      <w:lvlJc w:val="left"/>
+      <w:pPr>
+        <w:tabs>
+          <w:tab w:val="num" w:pos="1440"/>
+        </w:tabs>
+        <w:ind w:left="1440" w:hanging="360"/>
+      </w:pPr>
+      <w:rPr>
+        <w:rFonts w:ascii="Courier New" w:hAnsi="Courier New" w:hint="default"/>
+        <w:sz w:val="20"/>
+      </w:rPr>
+    </w:lvl>
+    <w:lvl w:ilvl="2" w:tentative="1">
+      <w:start w:val="1"/>
+      <w:numFmt w:val="bullet"/>
+      <w:lvlText w:val=""/>
+      <w:lvlJc w:val="left"/>
+      <w:pPr>
+        <w:tabs>
+          <w:tab w:val="num" w:pos="2160"/>
+        </w:tabs>
+        <w:ind w:left="2160" w:hanging="360"/>
+      </w:pPr>
+      <w:rPr>
+        <w:rFonts w:ascii="Wingdings" w:hAnsi="Wingdings" w:hint="default"/>
+        <w:sz w:val="20"/>
+      </w:rPr>
+    </w:lvl>
+    <w:lvl w:ilvl="3" w:tentative="1">
+      <w:start w:val="1"/>
+      <w:numFmt w:val="bullet"/>
+      <w:lvlText w:val=""/>
+      <w:lvlJc w:val="left"/>
+      <w:pPr>
+        <w:tabs>
+          <w:tab w:val="num" w:pos="2880"/>
+        </w:tabs>
+        <w:ind w:left="2880" w:hanging="360"/>
+      </w:pPr>
+      <w:rPr>
+        <w:rFonts w:ascii="Wingdings" w:hAnsi="Wingdings" w:hint="default"/>
+        <w:sz w:val="20"/>
+      </w:rPr>
+    </w:lvl>
+    <w:lvl w:ilvl="4" w:tentative="1">
+      <w:start w:val="1"/>
+      <w:numFmt w:val="bullet"/>
+      <w:lvlText w:val=""/>
+      <w:lvlJc w:val="left"/>
+      <w:pPr>
+        <w:tabs>
+          <w:tab w:val="num" w:pos="3600"/>
+        </w:tabs>
+        <w:ind w:left="3600" w:hanging="360"/>
+      </w:pPr>
+      <w:rPr>
+        <w:rFonts w:ascii="Wingdings" w:hAnsi="Wingdings" w:hint="default"/>
+        <w:sz w:val="20"/>
+      </w:rPr>
+    </w:lvl>
+    <w:lvl w:ilvl="5" w:tentative="1">
+      <w:start w:val="1"/>
+      <w:numFmt w:val="bullet"/>
+      <w:lvlText w:val=""/>
+      <w:lvlJc w:val="left"/>
+      <w:pPr>
+        <w:tabs>
+          <w:tab w:val="num" w:pos="4320"/>
+        </w:tabs>
+        <w:ind w:left="4320" w:hanging="360"/>
+      </w:pPr>
+      <w:rPr>
+        <w:rFonts w:ascii="Wingdings" w:hAnsi="Wingdings" w:hint="default"/>
+        <w:sz w:val="20"/>
+      </w:rPr>
+    </w:lvl>
+    <w:lvl w:ilvl="6" w:tentative="1">
+      <w:start w:val="1"/>
+      <w:numFmt w:val="bullet"/>
+      <w:lvlText w:val=""/>
+      <w:lvlJc w:val="left"/>
+      <w:pPr>
+        <w:tabs>
+          <w:tab w:val="num" w:pos="5040"/>
+        </w:tabs>
+        <w:ind w:left="5040" w:hanging="360"/>
+      </w:pPr>
+      <w:rPr>
+        <w:rFonts w:ascii="Wingdings" w:hAnsi="Wingdings" w:hint="default"/>
+        <w:sz w:val="20"/>
+      </w:rPr>
+    </w:lvl>
+    <w:lvl w:ilvl="7" w:tentative="1">
+      <w:start w:val="1"/>
+      <w:numFmt w:val="bullet"/>
+      <w:lvlText w:val=""/>
+      <w:lvlJc w:val="left"/>
+      <w:pPr>
+        <w:tabs>
+          <w:tab w:val="num" w:pos="5760"/>
+        </w:tabs>
+        <w:ind w:left="5760" w:hanging="360"/>
+      </w:pPr>
+      <w:rPr>
+        <w:rFonts w:ascii="Wingdings" w:hAnsi="Wingdings" w:hint="default"/>
+        <w:sz w:val="20"/>
+      </w:rPr>
+    </w:lvl>
+    <w:lvl w:ilvl="8" w:tentative="1">
+      <w:start w:val="1"/>
+      <w:numFmt w:val="bullet"/>
+      <w:lvlText w:val=""/>
+      <w:lvlJc w:val="left"/>
+      <w:pPr>
+        <w:tabs>
+          <w:tab w:val="num" w:pos="6480"/>
+        </w:tabs>
+        <w:ind w:left="6480" w:hanging="360"/>
+      </w:pPr>
+      <w:rPr>
+        <w:rFonts w:ascii="Wingdings" w:hAnsi="Wingdings" w:hint="default"/>
+        <w:sz w:val="20"/>
+      </w:rPr>
+    </w:lvl>
+  </w:abstractNum>
+  <w:abstractNum w:abstractNumId="9" w15:restartNumberingAfterBreak="0">
     <w:nsid w:val="68E560C2"/>
     <w:multiLevelType w:val="multilevel"/>
     <w:tmpl w:val="8D325506"/>
@@ -6240,7 +10184,7 @@
       </w:pPr>
     </w:lvl>
   </w:abstractNum>
-  <w:abstractNum w:abstractNumId="7" w15:restartNumberingAfterBreak="0">
+  <w:abstractNum w:abstractNumId="10" w15:restartNumberingAfterBreak="0">
     <w:nsid w:val="79940583"/>
     <w:multiLevelType w:val="multilevel"/>
     <w:tmpl w:val="3F0C202A"/>
@@ -6362,28 +10306,37 @@
     </w:lvl>
   </w:abstractNum>
   <w:num w:numId="1" w16cid:durableId="451217151">
-    <w:abstractNumId w:val="5"/>
+    <w:abstractNumId w:val="6"/>
   </w:num>
   <w:num w:numId="2" w16cid:durableId="1526019574">
     <w:abstractNumId w:val="0"/>
   </w:num>
   <w:num w:numId="3" w16cid:durableId="532037195">
-    <w:abstractNumId w:val="6"/>
+    <w:abstractNumId w:val="9"/>
   </w:num>
   <w:num w:numId="4" w16cid:durableId="1886679209">
     <w:abstractNumId w:val="1"/>
   </w:num>
   <w:num w:numId="5" w16cid:durableId="629357010">
+    <w:abstractNumId w:val="3"/>
+  </w:num>
+  <w:num w:numId="6" w16cid:durableId="721100222">
+    <w:abstractNumId w:val="10"/>
+  </w:num>
+  <w:num w:numId="7" w16cid:durableId="1878196952">
+    <w:abstractNumId w:val="4"/>
+  </w:num>
+  <w:num w:numId="8" w16cid:durableId="103161163">
+    <w:abstractNumId w:val="5"/>
+  </w:num>
+  <w:num w:numId="9" w16cid:durableId="1976524098">
     <w:abstractNumId w:val="2"/>
   </w:num>
-  <w:num w:numId="6" w16cid:durableId="721100222">
+  <w:num w:numId="10" w16cid:durableId="933830663">
+    <w:abstractNumId w:val="8"/>
+  </w:num>
+  <w:num w:numId="11" w16cid:durableId="306860118">
     <w:abstractNumId w:val="7"/>
-  </w:num>
-  <w:num w:numId="7" w16cid:durableId="1878196952">
-    <w:abstractNumId w:val="3"/>
-  </w:num>
-  <w:num w:numId="8" w16cid:durableId="103161163">
-    <w:abstractNumId w:val="4"/>
   </w:num>
 </w:numbering>
 </file>
@@ -7304,6 +11257,29 @@
       <w:spacing w:val="5"/>
     </w:rPr>
   </w:style>
+  <w:style w:type="character" w:styleId="Lienhypertexte">
+    <w:name w:val="Hyperlink"/>
+    <w:basedOn w:val="Policepardfaut"/>
+    <w:uiPriority w:val="99"/>
+    <w:unhideWhenUsed/>
+    <w:rsid w:val="00611EC9"/>
+    <w:rPr>
+      <w:color w:val="467886" w:themeColor="hyperlink"/>
+      <w:u w:val="single"/>
+    </w:rPr>
+  </w:style>
+  <w:style w:type="character" w:styleId="Mentionnonrsolue">
+    <w:name w:val="Unresolved Mention"/>
+    <w:basedOn w:val="Policepardfaut"/>
+    <w:uiPriority w:val="99"/>
+    <w:semiHidden/>
+    <w:unhideWhenUsed/>
+    <w:rsid w:val="00611EC9"/>
+    <w:rPr>
+      <w:color w:val="605E5C"/>
+      <w:shd w:val="clear" w:color="auto" w:fill="E1DFDD"/>
+    </w:rPr>
+  </w:style>
 </w:styles>
 </file>
 

</xml_diff>